<commit_message>
Re-run harmonisation from raw GWAS sumstats, export per-SNP data (code/26, validation vs mr_corrected_N 10/10 exact); add Figure6 MR scatter, Figure7 MR-PRESSO funnel, SupplFig1 remaining scatters, SupplFig2 leave-one-out; update ms legends/cross-refs; per-SNP CSVs into package; Submission_Package_v3.zip (49 files).
</commit_message>
<xml_diff>
--- a/submission_package_v2/Manuscript.docx
+++ b/submission_package_v2/Manuscript.docx
@@ -1748,7 +1748,7 @@
     </w:p>
     <w:p>
       <w:r>
-        <w:t>Five diagnostics support the causal reading: (1) consistent direction across all five exposures; (2) MR-Egger intercepts all p&gt;0.24, excluding directional horizontal pleiotropy; (3) weighted-median estimates agree in sign with IVW; (4) leave-one-out showed zero sign reversals, excluding single-SNP drivers; (5) the direction matches the LDSC r_g (+0.12 to +0.25). Heterogeneity was high (I² = 67–85%), and under random-effects IVW the arms (p=0.055) and legs (p=0.098) exposures were only borderline; the total-body, lumbar-spine and femoral-neck instruments remained significant (all p&lt;0.05).</w:t>
+        <w:t>Five diagnostics support the causal reading: (1) consistent direction across all five exposures; (2) MR-Egger intercepts all p&gt;0.24, excluding directional horizontal pleiotropy; (3) weighted-median estimates agree in sign with IVW; (4) leave-one-out showed zero sign reversals, excluding single-SNP drivers; (5) the direction matches the LDSC r_g (+0.12 to +0.25). Heterogeneity was high (I² = 67–85%), and under random-effects IVW the arms (p=0.055) and legs (p=0.098) exposures were only borderline; the total-body, lumbar-spine and femoral-neck instruments remained significant (all p&lt;0.05). Per-SNP scatter plots with IVW, MR-Egger and weighted-median fit lines are shown in Figure 6c (total-body BMD) and Supplementary Figure S1a–d (remaining exposures).</w:t>
       </w:r>
     </w:p>
     <w:p>
@@ -1761,7 +1761,7 @@
     </w:p>
     <w:p>
       <w:r>
-        <w:t xml:space="preserve">Reverse MR (knee OA as exposure) yielded non-significant effects on total-body BMD (β=+0.106, p=0.33) and femoral-neck BMD (β=+0.142, p=0.19), and knee OA showed no causal effect on fracture (β=+0.092, p=0.40). All three reverse/null estimates are on the N-corrected scale (§3.7); only the direction and p-value are informative here, as the absolute magnitude of the BMD-outcome effect inherits the same reconstruction uncertainty as the forward BMD exposure. Taken together with the null OA–fracture r_g, this indicates that the genetic sharing between OA and BMD is </w:t>
+        <w:t xml:space="preserve">Reverse MR (knee OA as exposure) yielded non-significant effects on total-body BMD (β=+0.106, p=0.33) and femoral-neck BMD (β=+0.142, p=0.19), and knee OA showed no causal effect on fracture (β=+0.092, p=0.40). All three reverse/null estimates are on the N-corrected scale (§3.7); only the direction and p-value are informative here, as the absolute magnitude of the BMD-outcome effect inherits the same reconstruction uncertainty as the forward BMD exposure. The per-SNP scatter for the representative null pair knee OA→total-body BMD (Figure 6d) shows a flat IVW slope with no visible pleiotropic structure, and the remaining null pairs are shown in Supplementary Figure S1e–f. Taken together with the null OA–fracture r_g, this indicates that the genetic sharing between OA and BMD is </w:t>
       </w:r>
       <w:r>
         <w:rPr>
@@ -1860,7 +1860,7 @@
     </w:p>
     <w:p>
       <w:r>
-        <w:t>We therefore conclude that the primary causal findings (BMD protects against fracture; BMD causally increases knee OA; no reverse OA→BMD or OA→fracture pathway) are robust both to pleiotropic outliers and to the instrument-clumping strategy.</w:t>
+        <w:t>We therefore conclude that the primary causal findings (BMD protects against fracture; BMD causally increases knee OA; no reverse OA→BMD or OA→fracture pathway) are robust both to pleiotropic outliers and to the instrument-clumping strategy. MR-PRESSO funnel plots for the four headline pairs are shown in Figure 7, with outlier instruments individually flagged; leave-one-out stability across all ten pairs is shown in Supplementary Figure S2.</w:t>
       </w:r>
     </w:p>
     <w:p>
@@ -2191,6 +2191,50 @@
       </w:r>
       <w:r>
         <w:t xml:space="preserve"> Conceptual causal architecture of the OA–BMD–fracture triangle. Solid coloured arrows denote MR causal effects: higher genetically predicted BMD protects against fracture (blue; positive control) and causally increases knee OA risk (red). Dashed grey arrows denote non-causal relationships: OA and BMD are positively genetically correlated (r_g = +0.12 to +0.25), but OA does not causally raise BMD or fracture risk.</w:t>
+      </w:r>
+    </w:p>
+    <w:p>
+      <w:r>
+        <w:rPr>
+          <w:b/>
+        </w:rPr>
+        <w:t>Figure 6.</w:t>
+      </w:r>
+      <w:r>
+        <w:t xml:space="preserve"> Per-SNP scatter plots of the MR exposure–outcome associations for four headline pairs. Each point is one instrument; grey bars are 95% confidence intervals of the SNP–exposure (x) and SNP–outcome (y) associations. Lines are the IVW (solid black, through the origin), MR-Egger (dashed orange, free intercept) and weighted-median (dotted purple) fits, with their slopes annotated in-panel. (a) Total-body BMD → fracture and (b) femoral-neck BMD → fracture: negative slopes (per 1-SD higher BMD, β = −0.337 and −0.351 log-OR), the positive control. (c) Total-body BMD → knee OA: positive slope (β = +0.023, P = 3.9×10⁻¹⁰). (d) Knee OA → total-body BMD: flat slope (β = +0.106, P = 0.33), the representative null. Red open circles mark instruments flagged as outliers by MR-PRESSO (Bonferroni α=0.05/K); their removal does not change any slope direction.</w:t>
+      </w:r>
+    </w:p>
+    <w:p>
+      <w:r>
+        <w:rPr>
+          <w:b/>
+        </w:rPr>
+        <w:t>Figure 7.</w:t>
+      </w:r>
+      <w:r>
+        <w:t xml:space="preserve"> MR-PRESSO funnel plots for the four headline pairs. Each point is one instrument plotted as its SNP-specific Wald ratio (x) against precision 1/SE (y), so the most precisely estimated instruments appear at the top. The solid black line is the IVW estimate from all instruments, the dashed orange line the MR-Egger estimate, and the grey curved lines the asymptotic 95% pseudo-confidence funnel around the IVW estimate. Red open circles are MR-PRESSO outlier instruments. Asymmetry about the IVW line reflects the high Cochran heterogeneity (§3.4–3.5) and motivates the outlier correction; the direction of the underlying effect is unchanged by that correction (§3.6).</w:t>
+      </w:r>
+    </w:p>
+    <w:p>
+      <w:r>
+        <w:rPr>
+          <w:b/>
+        </w:rPr>
+        <w:t>Supplementary Figure S1.</w:t>
+      </w:r>
+      <w:r>
+        <w:t xml:space="preserve"> Per-SNP scatter plots for the six remaining MR pairs (conventions as Figure 6): (a) femoral-neck, (b) lumbar-spine, (c) arms and (d) legs BMD → knee OA (all positive IVW slopes); (e) knee OA → fracture and (f) knee OA → femoral-neck BMD (both flat/null).</w:t>
+      </w:r>
+    </w:p>
+    <w:p>
+      <w:r>
+        <w:rPr>
+          <w:b/>
+        </w:rPr>
+        <w:t>Supplementary Figure S2.</w:t>
+      </w:r>
+      <w:r>
+        <w:t xml:space="preserve"> Leave-one-out stability of the IVW estimate for all ten MR pairs. Black points show the IVW estimate using all instruments (whiskers, 95% CI); the shaded blue band spans the minimum-to-maximum range of the estimates obtained by dropping each instrument in turn, with individual leave-one-out estimates as light blue dots. No leave-one-out estimate crosses the null line (dashed) for any pair, excluding single-instrument drivers of any conclusion.</w:t>
       </w:r>
     </w:p>
     <w:p>

</xml_diff>

<commit_message>
Verify BMD accessions per-site in GWAS Catalog (GCST90568448-58, N 30449-32017): per-site accessions+Ns into ms 2.1, quantified impact (<0.3% headline, 2.3% max lumbar) into 3.7, Table1 footnote refined; docs/10 checklist closed. Add preprint/prereg package (medRxiv statements + OSF retrospective prereg with deviation disclosure). Submission_Package_v4.zip; Preprint_Prereg_Package.zip.
</commit_message>
<xml_diff>
--- a/submission_package_v2/Manuscript.docx
+++ b/submission_package_v2/Manuscript.docx
@@ -339,7 +339,7 @@
         <w:t>Genomics Proteomics Bioinformatics</w:t>
       </w:r>
       <w:r>
-        <w:t xml:space="preserve">; doi:10.1093/gpbjnl/qzaf097, PMID 41206123; GWAS Catalog GCST90568457), DXA-derived BMD in N=31,873 European UK Biobank participants — this N resolves the prior header inconsistency and validates the corrected h² in Table 1; an independent back-calculation of N from the top-hit standard errors gave ≈29.7k, within ~7% of the reported 31,873 (the small difference is absorbed by the GEFOS validation in §3.7); </w:t>
+        <w:t xml:space="preserve">; doi:10.1093/gpbjnl/qzaf097, PMID 41206123), DXA-derived BMD at 11 skeletal sites in European UK Biobank participants, with verified per-site accession numbers and sample sizes in the GWAS Catalog series GCST90568448–58: lumbar spine GCST90568448 (N=30,449), legs GCST90568451 (N=31,873), pelvis GCST90568452 (N=31,873), total body GCST90568455 (N=31,986), trunk GCST90568456 (N=31,986), femur total GCST90568457 (N=31,873), femoral neck GCST90568458 (N=32,017); all N verified directly in the GWAS Catalog — an independent back-calculation of N from the top-hit standard errors gave ≈29.7k, within ~7% of the reported values (the small difference is absorbed by the GEFOS validation in §3.7); </w:t>
       </w:r>
       <w:r>
         <w:rPr>
@@ -388,7 +388,7 @@
         <w:t>docs/10_参考文献与原始GWAS来源.md</w:t>
       </w:r>
       <w:r>
-        <w:t>); the BMD GCST90568457 accession should be confirmed directly in the GWAS Catalog before submission. Files were in harmonised LDSC format (CHR, BP, SNP, A1, A2, MAF, N, Z, P) for the twelve munged traits; the fracture dataset was in raw GEFOS format (chromosome, base_pair_location, effect_allele, other_allele, beta, standard_error, effect_allele_frequency, p_value).</w:t>
+        <w:t>); all BMD accession numbers and per-site sample sizes were verified directly in the GWAS Catalog. Files were in harmonised LDSC format (CHR, BP, SNP, A1, A2, MAF, N, Z, P) for the twelve munged traits; the fracture dataset was in raw GEFOS format (chromosome, base_pair_location, effect_allele, other_allele, beta, standard_error, effect_allele_frequency, p_value).</w:t>
       </w:r>
     </w:p>
     <w:p>
@@ -1932,7 +1932,16 @@
         <w:t>8–10% lower</w:t>
       </w:r>
       <w:r>
-        <w:t xml:space="preserve"> with overlapping confidence intervals — close agreement given the different cohorts, fracture definitions and BMD measurement sites (total-body OR 1.40 is 9.6% below 1.55; femoral-neck OR 1.42 is 8.4% below). This constitutes external validation of the analysis pipeline by an independent consortium: the consistent direction and quantity (within ~10%) support that the reconstructed BMD effect scale is biologically reasonable. The exact BMD sample size (N = 31,873) is taken from the source publication's metadata (Qian et al. 2025), not inferred from the GEFOS comparison.</w:t>
+        <w:t xml:space="preserve"> with overlapping confidence intervals — close agreement given the different cohorts, fracture definitions and BMD measurement sites (total-body OR 1.40 is 9.6% below 1.55; femoral-neck OR 1.42 is 8.4% below). This constitutes external validation of the analysis pipeline by an independent consortium: the consistent direction and quantity (within ~10%) support that the reconstructed BMD effect scale is biologically reasonable. The exact BMD sample size is taken from the source publication's per-site metadata (Qian et al. 2025), not inferred from the GEFOS comparison. </w:t>
+      </w:r>
+      <w:r>
+        <w:rPr>
+          <w:b/>
+        </w:rPr>
+        <w:t>Per-site N varies within the accession series (30,449–32,017; §2.1); we verified that applying site-specific correction factors instead of the unified √(400,000/31,873) = 3.5426 changes the absolute β by less than 0.3% for the headline estimates (total-body and femoral-neck BMD) and by at most 2.3% for the smallest site (lumbar spine, N=30,449)</w:t>
+      </w:r>
+      <w:r>
+        <w:t xml:space="preserve"> — an order of magnitude below the 8–10% GEFOS agreement band, with no change to any rounded value reported in Table 3 (OR 1.40 / 1.42; all β to three decimals) and no effect whatsoever on z-statistics, p-values, directions or significance, which are N-scale-invariant.</w:t>
       </w:r>
     </w:p>
     <w:p>
@@ -3581,7 +3590,7 @@
     </w:p>
     <w:p>
       <w:r>
-        <w:t>‡ BMD N confirmed at 31,873 (Qian et al. 2025, European UKB DXA); h² computed at N=32,000, resolving the prior header inconsistency (×≈12.5 over the old 400k placeholder) and consistent with published DXA / whole-body BMD SNP-h² in the ≈0.25–0.40 range (the 10 sites span 0.26–0.39). Note eBMD (heel ultrasound) is a distinct trait and is not directly comparable to DXA BMD.</w:t>
+        <w:t>‡ BMD N verified per site in the GWAS Catalog (Qian et al. 2025, European UKB DXA; range 30,449–32,017 across the accession series, see §2.1); the unified N=31,873 is used for the h² reconstruction, and site-specific N would shift h² by ≤2.3% (lumbar spine) with all values remaining in the published DXA h² range of ≈0.25–0.40 (the 10 sites span 0.26–0.39). Note eBMD (heel ultrasound) is a distinct trait and is not directly comparable to DXA BMD.</w:t>
       </w:r>
     </w:p>
     <w:p>

</xml_diff>

<commit_message>
Figure-data integrity audit (verify_figures.py, 120 checks): (1) fix axis clipping - hardcoded xlims cut 6/10 CIs in Fig2a, 1/3 in Fig2d, 3/3 in Fig3c; axes now data-driven and dumped to figure_axis_limits.json for end-to-end check; (2) rewrite stale oa_h2_liability.csv (OA_selfrep was N=350k/K=0.25 -> now 462,933/0.083 = 0.0726; add fracture row 0.0620); (3) precise axis units log-OR vs SD per allele in MR figures; (4) Fig1 legend wording (diverging, centred on zero); (5) panel labels no longer overlap tick labels; provenance: rg matrix == LDSC long output, BH-FDR independent recompute, IVW from per-SNP data == Table 3 (max dbeta 1.4e-15). Submission_Package_v6.zip (51 files).
</commit_message>
<xml_diff>
--- a/submission_package_v2/Manuscript.docx
+++ b/submission_package_v2/Manuscript.docx
@@ -1730,7 +1730,7 @@
         <w:t xml:space="preserve"> q&lt;0.01, </w:t>
       </w:r>
       <w:r>
-        <w:t>** q&lt;0.001 across 78 pairs). Black lines separate the three phenotype groups. Colour scale is symmetric about zero.</w:t>
+        <w:t>** q&lt;0.001 across 78 pairs). Black lines separate the three phenotype groups. The colour scale is diverging and centred on zero.</w:t>
       </w:r>
     </w:p>
     <w:p>
@@ -1741,7 +1741,7 @@
         <w:t>Figure 2.</w:t>
       </w:r>
       <w:r>
-        <w:t xml:space="preserve"> Forest plot of key genetic correlations. Top panel: any-fracture versus ten BMD sites (all negative). Middle panels: knee OA and self-reported OA versus ten BMD sites (all positive). Bottom panels: the two OA definitions with each other (r_g=+0.84) and each with fracture (both non-significant). Error bars are 95% confidence intervals from block jackknife.</w:t>
+        <w:t xml:space="preserve"> Forest plot of key genetic correlations. Top panel: any-fracture versus ten BMD sites (all negative). Middle panels: knee OA and self-reported OA versus ten BMD sites (all positive). Bottom panels: the two OA definitions with each other (r_g=+0.84) and each with fracture (both non-significant). Error bars are 95% confidence intervals from block jackknife. The x-axis range is scaled to the data in each panel so that every interval is shown in full.</w:t>
       </w:r>
     </w:p>
     <w:p>
@@ -1752,7 +1752,7 @@
         <w:t>Figure 3.</w:t>
       </w:r>
       <w:r>
-        <w:t xml:space="preserve"> Forest plot of MR estimates on the N-corrected effect scale (BMD N = 31,873; §3.7). Upper panel: the BMD→fracture positive control (total-body and femoral-neck BMD, both strongly protective; per 1-SD lower BMD, OR ≈ 1.40–1.42, matching the GEFOS benchmark of 1.55). Middle panel: the five BMD exposures against knee OA (all positively causal). Lower panel: reverse/null pairs (knee OA → fracture and knee OA → BMD, all non-significant, p = 0.34–0.40). Points are IVW fixed-effects estimates with 95% CI; blue = protective, red = risk-increasing, grey = null; dashed line = null. Directions were unchanged after MR-PRESSO outlier correction (§3.6) and under strict versus 1-Mb clumping (§3.3).</w:t>
+        <w:t xml:space="preserve"> Forest plot of MR estimates on the N-corrected effect scale (BMD N = 31,873; §3.7). Upper panel: the BMD→fracture positive control (total-body and femoral-neck BMD, both strongly protective; per 1-SD lower BMD, OR ≈ 1.40–1.42, matching the GEFOS benchmark of 1.55). Middle panel: the five BMD exposures against knee OA (all positively causal). Lower panel: reverse/null pairs (knee OA → fracture and knee OA → BMD, all non-significant, p = 0.34–0.40). Points are IVW fixed-effects estimates with 95% CI; blue = protective, red = risk-increasing, grey = null; dashed line = null. The x-axis range is scaled to the data in each panel so that every interval is shown in full. Directions were unchanged after MR-PRESSO outlier correction (§3.6) and under strict versus 1-Mb clumping (§3.3).</w:t>
       </w:r>
     </w:p>
     <w:p>

</xml_diff>

<commit_message>
OA_B_PROJECT v7: clear [REF] placeholders, add MR sample-overlap section (2.8), fix positive-control Egger p=0.010 wording
</commit_message>
<xml_diff>
--- a/submission_package_v2/Manuscript.docx
+++ b/submission_package_v2/Manuscript.docx
@@ -165,12 +165,12 @@
     </w:p>
     <w:p>
       <w:r>
-        <w:t>Osteoarthritis (OA) and bone mineral density (BMD) are the two most prevalent skeletal traits in ageing populations, and the nature of their epidemiological association has been debated since Foss and Byers reported raised femoral-head BMD in osteoarthritic hips in 1972 [11]. Observational studies have since linked higher areal BMD to increased OA prevalence and incidence, although osteoporosis and OA were long regarded as opposing conditions [11]. The direction matters clinically. If high BMD predisposes to OA, then treatments that increase bone mass may carry an OA cost. If OA raises BMD through altered joint loading, the interpretation is different.</w:t>
+        <w:t>Osteoarthritis (OA) and bone mineral density (BMD) are the two most prevalent skeletal traits in ageing populations, and the nature of their epidemiological association has been debated since Foss and Byers reported raised femoral-head BMD in osteoarthritic hips in 1972 [11]. Observational studies have since linked higher areal BMD to increased OA prevalence and incidence, although osteoporosis and OA were long regarded as opposing conditions [12]. The direction matters clinically. If high BMD predisposes to OA, then treatments that increase bone mass may carry an OA cost. If OA raises BMD through altered joint loading, the interpretation is different.</w:t>
       </w:r>
     </w:p>
     <w:p>
       <w:r>
-        <w:t>Genome-wide data can separate these explanations. Linkage disequilibrium score regression (LDSC) estimates genetic correlation (r_g) from summary statistics, tolerates sample overlap, and is unbiased by stratification when the intercept is near unity [6]. Two-sample Mendelian randomisation (MR) uses genetic variants as instruments to interrogate causality [7]. Applied to OA and BMD, both have given partial answers. Hackinger et al. reported r_g=+0.18 between hip/knee OA and lumbar-spine BMD (p=0.022) [4]; Zhou et al. reported r_g=+0.13 by LDSC and +0.17 by HDL between hip OA and femoral-neck BMD, with bidirectional MR supporting a negative causal effect of femoral-neck BMD on hip OA [5].</w:t>
+        <w:t>Genome-wide data can separate these explanations. Linkage disequilibrium score regression (LDSC) estimates genetic correlation (r_g) from summary statistics, tolerates sample overlap, and is unbiased by stratification when the intercept is near unity [6]. Two-sample Mendelian randomisation (MR) uses genetic variants as instruments to interrogate causality [13]. Applied to OA and BMD, both have given partial answers. Hackinger et al. reported r_g=+0.18 between hip/knee OA and lumbar-spine BMD (p=0.022) [4]; Zhou et al. reported r_g=+0.13 by LDSC and +0.17 by high-definition likelihood (HDL) inference between hip OA and femoral-neck BMD, with bidirectional MR supporting a negative causal effect of femoral-neck BMD on hip OA [5].</w:t>
       </w:r>
     </w:p>
     <w:p>
@@ -620,6 +620,49 @@
     </w:p>
     <w:p>
       <w:pPr>
+        <w:pStyle w:val="Heading2"/>
+      </w:pPr>
+      <w:r>
+        <w:t>2.8 Assessment of sample overlap in two-sample MR</w:t>
+      </w:r>
+    </w:p>
+    <w:p>
+      <w:r>
+        <w:t xml:space="preserve">Two-sample MR assumes independent exposure and outcome samples. This assumption is partly violated here because of shared UK Biobank (UKB) participants. All ten BMD sites are European-UKB DXA measures (N=31,873; Qian et al. 2025), OA_selfrep is wholly UKB (N=462,933; IEU </w:t>
+      </w:r>
+      <w:r>
+        <w:rPr>
+          <w:rFonts w:ascii="Consolas" w:hAnsi="Consolas"/>
+          <w:sz w:val="18"/>
+        </w:rPr>
+        <w:t>ukb-b-14486</w:t>
+      </w:r>
+      <w:r>
+        <w:t>), and the OA_knee (GO Consortium European meta-analysis, full sample ≈1.32M) and fracture (GEFOS 2018, which incorporates UKB) GWAS each contain a UKB component. Every MR pair in Table 3 therefore shares UKB individuals: in the BMD-exposure pairs the entire BMD sample overlaps the UKB component of the OA_knee or fracture GWAS; in the OA_knee-exposure pairs the UKB subset of OA_knee overlaps the wholly-UKB BMD or the UKB component of fracture.</w:t>
+      </w:r>
+    </w:p>
+    <w:p>
+      <w:r>
+        <w:t>Sample overlap correlates the exposure and outcome summary statistics and biases the IVW estimate toward the corresponding observational genetic correlation (r_g) [14]; the bias scales with the overlap fraction and acts in the direction of r_g. Because our r_g are positive for BMD–OA and negative for BMD–fracture, overlap would inflate the IVW β magnitude in the same direction as the findings, without reversing the sign or altering p-values, z-statistics or directions, which are overlap-invariant.</w:t>
+      </w:r>
+    </w:p>
+    <w:p>
+      <w:r>
+        <w:t>We addressed overlap in three ways. First, we report MR-Egger, weighted median and MR-PRESSO alongside IVW, so conclusions do not rest on the IVW point estimate alone; the MR-Egger intercept is a test for directional pleiotropy that is partly robust to balanced overlap. Second, we quantified the empirical correlation between exposure and outcome association statistics across the harmonised instruments, ρ_GE = corr(β_e/se_e, β_o/se_o), as an overlap/pleiotropy gauge (</w:t>
+      </w:r>
+      <w:r>
+        <w:rPr>
+          <w:rFonts w:ascii="Consolas" w:hAnsi="Consolas"/>
+          <w:sz w:val="18"/>
+        </w:rPr>
+        <w:t>overlap_statistics.csv</w:t>
+      </w:r>
+      <w:r>
+        <w:t>, Supplementary); ρ_GE has the same sign as the MR effect for every pair (positive for BMD→OA, negative for BMD→fracture; range −0.79 to +0.46 across the ten pairs), confirming that the IVW direction is not driven by a single anti-correlated instrument. Third, an overlap-robust correction (MRlap; Mounier &amp; Kutalik 2023 [15]) and a sensitivity analysis restricted to the non-UKB components of the GO and GEFOS consortia are planned before final inference; the wholly-UKB BMD and OA_selfrep GWAS cannot be separated from their UKB overlap, so the BMD-exposure pairs retain some residual overlap that the robust estimators above are intended to absorb.</w:t>
+      </w:r>
+    </w:p>
+    <w:p>
+      <w:pPr>
         <w:pStyle w:val="Heading1"/>
       </w:pPr>
       <w:r>
@@ -682,7 +725,7 @@
     </w:p>
     <w:p>
       <w:r>
-        <w:t>Two-sample MR using 31 independent instruments for total-body BMD showed that genetically predicted higher BMD reduces fracture risk: IVW β = −0.337 per SD (SE 0.022, p = 3.7×10⁻⁵¹), equivalent to OR = 1.40 (95% CI 1.34–1.46) for fracture per 1-SD lower BMD. The estimate held under random effects (p = 2.4×10⁻¹²), the MR-Egger intercept was null (p = 0.558), the weighted median agreed (−0.39 per SD), and leave-one-out produced no sign reversal. Radial analysis flagged 5 of the 31 SNPs as outliers; excluding them did not change the estimate (Table 3). The femoral-neck instrument set (25 SNPs, strict clump) gave a concordant result (β = −0.351 per SD; OR = 1.42, 95% CI 1.34–1.51 per SD lower), and the conservative 1-Mb sensitivity set (26 SNPs) gave β = −0.366 (OR = 1.44, 95% CI 1.36–1.53); the two clumping strategies agree to within 1.5%. These magnitudes also agree with the published GEFOS estimate (OR = 1.55, 95% CI 1.48–1.63 per SD lower femoral-neck BMD, Trajanoska et al. 2018), obtained in different cohorts (§3.7). The positive control therefore validates the pipeline in both direction and magnitude.</w:t>
+        <w:t>Two-sample MR using 31 independent instruments for total-body BMD showed that genetically predicted higher BMD reduces fracture risk: IVW β = −0.337 per SD (SE 0.022, p = 3.7×10⁻⁵¹), equivalent to OR = 1.40 (95% CI 1.34–1.46) for fracture per 1-SD lower BMD. The estimate held under random effects (p = 2.4×10⁻¹²), the MR-Egger intercept was null (p = 0.558), the weighted median agreed (−0.39 per SD), and leave-one-out produced no sign reversal. Radial analysis flagged 5 of the 31 SNPs as outliers; excluding them did not change the estimate (Table 3). The femoral-neck instrument set (25 SNPs, strict clump) gave a concordant result (β = −0.351 per SD; OR = 1.42, 95% CI 1.34–1.51 per SD lower), and the conservative 1-Mb sensitivity set (26 SNPs) gave β = −0.366 (OR = 1.44, 95% CI 1.36–1.53); the two clumping strategies agree to within 1.5%. These magnitudes also agree with the published GEFOS estimate (OR = 1.55, 95% CI 1.48–1.63 per SD lower femoral-neck BMD, Trajanoska et al. 2018), obtained in different cohorts (§3.7). The positive control therefore validates the pipeline in direction. For the total-body BMD→fracture pair the MR-Egger intercept is null (p=0.558), so the IVW magnitude is unconfounded by directional pleiotropy. For the femoral-neck BMD→fracture pair the MR-Egger intercept is significant (p=0.010, Table 3), indicating some directional pleiotropy; the MR-Egger slope (−0.351) and weighted median (−0.373) remain strongly protective and close to the IVW estimate, so the protective conclusion is robust to pleiotropy, although the IVW point estimate may be modestly inflated and should be read with that caveat.</w:t>
       </w:r>
     </w:p>
     <w:p>
@@ -1683,7 +1726,7 @@
         <w:t>docs/10_参考文献与原始GWAS来源.md</w:t>
       </w:r>
       <w:r>
-        <w:t>), and the sample sizes used (knee OA 1,208,397; BMD 31,873; OA_selfrep 462,933; fracture 264,973) are confirmed against those sources.</w:t>
+        <w:t>), and the sample sizes used (knee OA 1,208,397; BMD 31,873; OA_selfrep 462,933; fracture 264,973) are confirmed against those sources. The femoral-neck BMD→fracture positive-control pair shows a significant MR-Egger intercept (p=0.010), so its IVW magnitude may be inflated by directional pleiotropy or sample overlap (§2.8); the MR-Egger slope and weighted median remain strongly protective, and the total-body BMD→fracture pair (Egger p=0.558) is the primary positive control.</w:t>
       </w:r>
     </w:p>
     <w:p>
@@ -6091,7 +6134,7 @@
         <w:t>lower</w:t>
       </w:r>
       <w:r>
-        <w:t xml:space="preserve"> BMD, matching the independent GEFOS benchmark of 1.55 (§3.7).</w:t>
+        <w:t xml:space="preserve"> BMD, matching the independent GEFOS benchmark of 1.55 (§3.7). For BMD femoral neck → fracture the MR-Egger intercept is significant (p=0.010), indicating directional pleiotropy; the MR-Egger slope (−0.351) and weighted median (−0.373) are reported as the pleiotropy-robust estimates for that pair, and the IVW point estimate may be modestly inflated (see §3.3).</w:t>
       </w:r>
     </w:p>
     <w:p>
@@ -6254,7 +6297,7 @@
     </w:p>
     <w:p>
       <w:r>
-        <w:t xml:space="preserve">11. Foss MV, Byers PD. Bone density, osteoarthrosis of the hip, and fracture. </w:t>
+        <w:t xml:space="preserve">11. Foss MV, Byers PD. Bone density, osteoarthrosis of the hip, and fracture of the upper end of the femur. </w:t>
       </w:r>
       <w:r>
         <w:rPr>
@@ -6263,7 +6306,63 @@
         <w:t>Ann Rheum Dis</w:t>
       </w:r>
       <w:r>
-        <w:t>. 1972;31(3):259–264.</w:t>
+        <w:t>. 1972;31(4):259–264. doi:10.1136/ard.31.4.259.</w:t>
+      </w:r>
+    </w:p>
+    <w:p>
+      <w:r>
+        <w:t xml:space="preserve">12. Dequeker J, Aerssens J, Luyten FP. Osteoarthritis and osteoporosis: clinical and research evidence of inverse relationship. </w:t>
+      </w:r>
+      <w:r>
+        <w:rPr>
+          <w:i/>
+        </w:rPr>
+        <w:t>Aging Clin Exp Res</w:t>
+      </w:r>
+      <w:r>
+        <w:t>. 2003;15(5):426–439. doi:10.1007/BF03327364.</w:t>
+      </w:r>
+    </w:p>
+    <w:p>
+      <w:r>
+        <w:t xml:space="preserve">13. Davey Smith G, Ebrahim S. 'Mendelian randomization': can genetic epidemiology contribute to understanding environmental determinants of disease? </w:t>
+      </w:r>
+      <w:r>
+        <w:rPr>
+          <w:i/>
+        </w:rPr>
+        <w:t>Int J Epidemiol</w:t>
+      </w:r>
+      <w:r>
+        <w:t>. 2003;32(1):1–22. doi:10.1093/ije/dyg070.</w:t>
+      </w:r>
+    </w:p>
+    <w:p>
+      <w:r>
+        <w:t xml:space="preserve">14. Burgess S, Thompson SG. Interpreting findings from Mendelian randomization using the MR-Egger method. </w:t>
+      </w:r>
+      <w:r>
+        <w:rPr>
+          <w:i/>
+        </w:rPr>
+        <w:t>Eur J Epidemiol</w:t>
+      </w:r>
+      <w:r>
+        <w:t>. 2017;32(5):377–389. doi:10.1007/s10654-017-0255-0.</w:t>
+      </w:r>
+    </w:p>
+    <w:p>
+      <w:r>
+        <w:t xml:space="preserve">15. Mounier N, Kutalik Z. Bias correction for inverse variance weighted Mendelian randomization. </w:t>
+      </w:r>
+      <w:r>
+        <w:rPr>
+          <w:i/>
+        </w:rPr>
+        <w:t>Genet Epidemiol</w:t>
+      </w:r>
+      <w:r>
+        <w:t>. 2023;47:e22522. doi:10.1002/gepi.22522.</w:t>
       </w:r>
     </w:p>
     <w:p/>

</xml_diff>

<commit_message>
OA_B_PROJECT v8: add MR statistical power analysis (3.8 + Table 4); markdown is single source of truth for refs
</commit_message>
<xml_diff>
--- a/submission_package_v2/Manuscript.docx
+++ b/submission_package_v2/Manuscript.docx
@@ -130,7 +130,7 @@
         <w:t>Results.</w:t>
       </w:r>
       <w:r>
-        <w:t xml:space="preserve"> LDSC resolved three blocks. The ten BMD sites were strongly inter-correlated (r_g 0.69–0.96; all q&lt;0.001); both OA definitions correlated positively with every BMD site (r_g 0.12–0.25; all q&lt;0.001); and the two OA definitions correlated with each other at r_g=+0.84. Fracture correlated negatively with every BMD site (r_g −0.45 to −0.60; all q&lt;0.001), reproducing the established inverse BMD–fracture relationship. MR reproduced the positive control (BMD→fracture β=−0.337 per SD, OR 1.40, p=3.7×10⁻⁵¹) and showed that genetically predicted higher BMD raised knee OA risk (β +0.02 to +0.03 per SD across five sites; p_IVW &lt;1×10⁻⁴; MR-Egger intercepts all p&gt;0.24). Reverse MR (OA→BMD) and OA→fracture were null.</w:t>
+        <w:t xml:space="preserve"> LDSC resolved three blocks. The ten BMD sites were strongly inter-correlated (r_g 0.69–0.96; all q&lt;0.001); both OA definitions correlated positively with every BMD site (r_g 0.12–0.25; all q&lt;0.001); and the two OA definitions correlated with each other at r_g=+0.84. Fracture correlated negatively with every BMD site (r_g −0.45 to −0.60; all q&lt;0.001), reproducing the established inverse BMD–fracture relationship. MR reproduced the positive control (BMD→fracture β=−0.337 per SD, OR 1.40, p=3.7×10⁻⁵¹) and showed that genetically predicted higher BMD raised knee OA risk (β +0.02 to +0.03 per SD across five sites; p_IVW &lt;1×10⁻⁴; MR-Egger intercepts all p&gt;0.24). Reverse MR (OA→BMD) and OA→fracture were null, although these three estimates were underpowered (achieved power 0.14–0.26 for effects of the observed magnitude; §3.8).</w:t>
       </w:r>
     </w:p>
     <w:p>
@@ -141,7 +141,7 @@
         <w:t>Conclusion.</w:t>
       </w:r>
       <w:r>
-        <w:t xml:space="preserve"> Higher BMD protects against fracture but raises OA risk, and OA does not raise BMD in turn. The OA–BMD association is therefore bidirectional in genetic correlation and unidirectional in causation, and it offers no route from OA to fracture. Interventions that increase bone mass should be assessed for site-specific OA outcomes.</w:t>
+        <w:t xml:space="preserve"> Higher BMD protects against fracture but raises OA risk, and OA does not raise BMD in turn. The OA–BMD association is therefore bidirectional in genetic correlation and, as far as the well-powered estimates show, unidirectional in causation; we found no route from OA to fracture through the BMD pathway, although a moderate contribution cannot be excluded (§3.8). Interventions that increase bone mass should be assessed for site-specific OA outcomes.</w:t>
       </w:r>
     </w:p>
     <w:p>
@@ -1568,7 +1568,7 @@
     </w:p>
     <w:p>
       <w:r>
-        <w:t>In reverse MR, knee OA as exposure gave non-significant effects on total-body BMD (β=+0.106, p=0.33) and femoral-neck BMD (β=+0.142, p=0.19), and no causal effect on fracture (β=+0.092, p=0.40). These three estimates are on the N-corrected scale (§3.7); only their direction and p-values can be interpreted, because the absolute magnitude of a BMD-outcome effect carries the same reconstruction uncertainty as the forward BMD exposure. The per-SNP scatter for knee OA→total-body BMD (Figure 6d) is flat, with no apparent pleiotropic structure, and the remaining null pairs are in Supplementary Figure S1e–f. Together with the null OA–fracture r_g, these results indicate that genetic sharing between OA and BMD runs in one direction (BMD→OA), and that the OA–BMD association does not translate into fracture risk through the BMD pathway.</w:t>
+        <w:t>In reverse MR, knee OA as exposure gave non-significant effects on total-body BMD (β=+0.106, p=0.33) and femoral-neck BMD (β=+0.142, p=0.19), and no causal effect on fracture (β=+0.092, p=0.40). These three estimates are on the N-corrected scale (§3.7); only their direction and p-values can be interpreted, because the absolute magnitude of a BMD-outcome effect carries the same reconstruction uncertainty as the forward BMD exposure. The per-SNP scatter for knee OA→total-body BMD (Figure 6d) is flat, with no apparent pleiotropic structure, and the remaining null pairs are in Supplementary Figure S1e–f. Together with the null OA–fracture r_g, these results are consistent with genetic sharing between OA and BMD running in one direction (BMD→OA). These three null estimates are, however, weakly powered (achieved power 0.14–0.26; §3.8): they exclude large effects but not moderate ones, and are better described as an absence of evidence than as evidence of absence.</w:t>
       </w:r>
     </w:p>
     <w:p>
@@ -1648,6 +1648,39 @@
     </w:p>
     <w:p>
       <w:pPr>
+        <w:pStyle w:val="Heading2"/>
+      </w:pPr>
+      <w:r>
+        <w:t>3.8 Statistical power of the MR estimates</w:t>
+      </w:r>
+    </w:p>
+    <w:p>
+      <w:r>
+        <w:t xml:space="preserve">A non-significant IVW estimate is informative only if the analysis could have detected an effect of a plausible size. We therefore computed, for every pair, the minimum detectable effect at 80% power with a two-sided α = 0.05, MDE = (1.96 + 0.84) × SE, together with the achieved power for the observed point estimate (Table 4; </w:t>
+      </w:r>
+      <w:r>
+        <w:rPr>
+          <w:rFonts w:ascii="Consolas" w:hAnsi="Consolas"/>
+          <w:sz w:val="18"/>
+        </w:rPr>
+        <w:t>mr_power.csv</w:t>
+      </w:r>
+      <w:r>
+        <w:t>, Supplementary). Because β and its SE scale identically, the ratio |β|/SE — and hence every power statement here — is invariant to the sample-scale correction of §3.7.</w:t>
+      </w:r>
+    </w:p>
+    <w:p>
+      <w:r>
+        <w:t>The seven pairs underlying the positive-control and BMD→OA findings were well powered: achieved power was 0.93–1.00, and even the smallest significant effect (femoral-neck BMD→knee OA, β = +0.017, SE = 0.005) retained 93% power. The three null pairs were not. With SE = 0.108 they could exclude only |β| ≥ 0.303, and the observed estimates (+0.092 for knee OA→fracture; +0.106 and +0.142 for knee OA→BMD) all lie inside that bound, with achieved power of 0.14, 0.17 and 0.26 respectively. On the log-odds scale of the fracture outcome the bound corresponds to OR ≈ 1.36 per unit of the exposure contrast as scaled in Table 3, subject to the scale caveats of §3.5 and §3.7.</w:t>
+      </w:r>
+    </w:p>
+    <w:p>
+      <w:r>
+        <w:t>This asymmetry governs interpretation. The BMD→fracture and BMD→OA conclusions rest on well-powered estimates and stand as reported. The reverse and OA→fracture results exclude large effects but are compatible with moderate ones in the direction of their own point estimates, so they should be read as an absence of evidence rather than as evidence of absence.</w:t>
+      </w:r>
+    </w:p>
+    <w:p>
+      <w:pPr>
         <w:pStyle w:val="Heading1"/>
       </w:pPr>
       <w:r>
@@ -1690,7 +1723,7 @@
     </w:p>
     <w:p>
       <w:r>
-        <w:t>Neither LDSC (r_g = +0.15 and +0.21, both non-significant after FDR) nor MR (β = +0.092, p = 0.395) supported a genetic relationship between OA and fracture. Patients with OA do sustain fractures, but our results indicate that this burden is not mediated by inherited differences in bone quantity. Falls, pain-related immobility, sarcopenia and medication effects are more likely explanations, and they lie largely outside the BMD genetic architecture captured here. The dissociation is itself informative: OA's fracture burden appears to be environmental and functional rather than skeletal-genetic.</w:t>
+        <w:t>Neither LDSC (r_g = +0.15 and +0.21, both non-significant after FDR) nor MR (β = +0.092, p = 0.395) supported a genetic relationship between OA and fracture. The MR component of this null is weakly powered (§3.8): it excludes |β| ≥ 0.30 but not the smaller effects compatible with its own point estimate, so it should not be read as excluding a moderate causal contribution. Patients with OA do sustain fractures, but our results indicate that this burden is not mediated by inherited differences in bone quantity. Falls, pain-related immobility, sarcopenia and medication effects are more likely explanations, and they lie largely outside the BMD genetic architecture captured here. The dissociation is itself informative: OA's fracture burden appears to be environmental and functional rather than skeletal-genetic.</w:t>
       </w:r>
     </w:p>
     <w:p>
@@ -1726,7 +1759,7 @@
         <w:t>docs/10_参考文献与原始GWAS来源.md</w:t>
       </w:r>
       <w:r>
-        <w:t>), and the sample sizes used (knee OA 1,208,397; BMD 31,873; OA_selfrep 462,933; fracture 264,973) are confirmed against those sources. The femoral-neck BMD→fracture positive-control pair shows a significant MR-Egger intercept (p=0.010), so its IVW magnitude may be inflated by directional pleiotropy or sample overlap (§2.8); the MR-Egger slope and weighted median remain strongly protective, and the total-body BMD→fracture pair (Egger p=0.558) is the primary positive control.</w:t>
+        <w:t>), and the sample sizes used (knee OA 1,208,397; BMD 31,873; OA_selfrep 462,933; fracture 264,973) are confirmed against those sources. The femoral-neck BMD→fracture positive-control pair shows a significant MR-Egger intercept (p=0.010), so its IVW magnitude may be inflated by directional pleiotropy or sample overlap (§2.8); the MR-Egger slope and weighted median remain strongly protective, and the total-body BMD→fracture pair (Egger p=0.558) is the primary positive control. The reverse and OA→fracture estimates are underpowered (achieved power 0.14–0.26; §3.8, Table 4) and can exclude only |β| ≥ 0.30, so moderate effects in the direction of their point estimates remain compatible with the data.</w:t>
       </w:r>
     </w:p>
     <w:p>
@@ -1739,7 +1772,7 @@
     </w:p>
     <w:p>
       <w:r>
-        <w:t>Genetically higher BMD protects against fracture and raises knee OA risk, with no evidence of reverse causation or of a genetic pathway from OA to fracture. The OA–BMD association is therefore bidirectional in genetic correlation but unidirectional in causation, and the fracture burden in OA is unlikely to run through the BMD pathway. The practical implication is that trials of treatments that increase bone mass should record incident OA at the joint of interest, not fracture alone.</w:t>
+        <w:t>Genetically higher BMD protects against fracture and raises knee OA risk. We found no evidence of reverse causation or of a genetic pathway from OA to fracture, but those three estimates were underpowered and exclude only large effects (§3.8). The OA–BMD association is bidirectional in genetic correlation and, as far as the well-powered estimates show, unidirectional in causation; the fracture burden in OA is unlikely to run through the BMD pathway, although a moderate contribution cannot be excluded. The practical implication is that trials of treatments that increase bone mass should record incident OA at the joint of interest, not fracture alone.</w:t>
       </w:r>
     </w:p>
     <w:p>
@@ -6135,6 +6168,1668 @@
       </w:r>
       <w:r>
         <w:t xml:space="preserve"> BMD, matching the independent GEFOS benchmark of 1.55 (§3.7). For BMD femoral neck → fracture the MR-Egger intercept is significant (p=0.010), indicating directional pleiotropy; the MR-Egger slope (−0.351) and weighted median (−0.373) are reported as the pleiotropy-robust estimates for that pair, and the IVW point estimate may be modestly inflated (see §3.3).</w:t>
+      </w:r>
+    </w:p>
+    <w:p>
+      <w:pPr>
+        <w:pStyle w:val="Heading1"/>
+      </w:pPr>
+      <w:r>
+        <w:t>Table 4. Statistical power of the two-sample MR estimates</w:t>
+      </w:r>
+    </w:p>
+    <w:tbl>
+      <w:tblPr>
+        <w:tblStyle w:val="TableGrid"/>
+        <w:tblW w:type="auto" w:w="0"/>
+        <w:jc w:val="center"/>
+        <w:tblLook w:firstColumn="1" w:firstRow="1" w:lastColumn="0" w:lastRow="0" w:noHBand="0" w:noVBand="1" w:val="04A0"/>
+      </w:tblPr>
+      <w:tblGrid>
+        <w:gridCol w:w="1080"/>
+        <w:gridCol w:w="1080"/>
+        <w:gridCol w:w="1080"/>
+        <w:gridCol w:w="1080"/>
+        <w:gridCol w:w="1080"/>
+        <w:gridCol w:w="1080"/>
+        <w:gridCol w:w="1080"/>
+        <w:gridCol w:w="1080"/>
+      </w:tblGrid>
+      <w:tr>
+        <w:tc>
+          <w:tcPr>
+            <w:tcW w:type="dxa" w:w="1170"/>
+            <w:shd w:val="clear" w:color="auto" w:fill="D9E2F3"/>
+          </w:tcPr>
+          <w:p>
+            <w:r>
+              <w:rPr>
+                <w:b/>
+                <w:sz w:val="17"/>
+              </w:rPr>
+            </w:r>
+            <w:r>
+              <w:rPr>
+                <w:b/>
+                <w:sz w:val="17"/>
+              </w:rPr>
+              <w:t>Exposure → Outcome</w:t>
+            </w:r>
+          </w:p>
+        </w:tc>
+        <w:tc>
+          <w:tcPr>
+            <w:tcW w:type="dxa" w:w="1170"/>
+            <w:shd w:val="clear" w:color="auto" w:fill="D9E2F3"/>
+          </w:tcPr>
+          <w:p>
+            <w:r>
+              <w:rPr>
+                <w:b/>
+                <w:sz w:val="17"/>
+              </w:rPr>
+            </w:r>
+            <w:r>
+              <w:rPr>
+                <w:b/>
+                <w:sz w:val="17"/>
+              </w:rPr>
+              <w:t>K</w:t>
+            </w:r>
+          </w:p>
+        </w:tc>
+        <w:tc>
+          <w:tcPr>
+            <w:tcW w:type="dxa" w:w="1170"/>
+            <w:shd w:val="clear" w:color="auto" w:fill="D9E2F3"/>
+          </w:tcPr>
+          <w:p>
+            <w:r>
+              <w:rPr>
+                <w:b/>
+                <w:sz w:val="17"/>
+              </w:rPr>
+            </w:r>
+            <w:r>
+              <w:rPr>
+                <w:b/>
+                <w:sz w:val="17"/>
+              </w:rPr>
+              <w:t>IVW β</w:t>
+            </w:r>
+          </w:p>
+        </w:tc>
+        <w:tc>
+          <w:tcPr>
+            <w:tcW w:type="dxa" w:w="1170"/>
+            <w:shd w:val="clear" w:color="auto" w:fill="D9E2F3"/>
+          </w:tcPr>
+          <w:p>
+            <w:r>
+              <w:rPr>
+                <w:b/>
+                <w:sz w:val="17"/>
+              </w:rPr>
+            </w:r>
+            <w:r>
+              <w:rPr>
+                <w:b/>
+                <w:sz w:val="17"/>
+              </w:rPr>
+              <w:t>SE</w:t>
+            </w:r>
+          </w:p>
+        </w:tc>
+        <w:tc>
+          <w:tcPr>
+            <w:tcW w:type="dxa" w:w="1170"/>
+            <w:shd w:val="clear" w:color="auto" w:fill="D9E2F3"/>
+          </w:tcPr>
+          <w:p>
+            <w:r>
+              <w:rPr>
+                <w:b/>
+                <w:sz w:val="17"/>
+              </w:rPr>
+            </w:r>
+            <w:r>
+              <w:rPr>
+                <w:b/>
+                <w:sz w:val="17"/>
+              </w:rPr>
+              <w:t>abs z</w:t>
+            </w:r>
+          </w:p>
+        </w:tc>
+        <w:tc>
+          <w:tcPr>
+            <w:tcW w:type="dxa" w:w="1170"/>
+            <w:shd w:val="clear" w:color="auto" w:fill="D9E2F3"/>
+          </w:tcPr>
+          <w:p>
+            <w:r>
+              <w:rPr>
+                <w:b/>
+                <w:sz w:val="17"/>
+              </w:rPr>
+            </w:r>
+            <w:r>
+              <w:rPr>
+                <w:b/>
+                <w:sz w:val="17"/>
+              </w:rPr>
+              <w:t>MDE (80% power)</w:t>
+            </w:r>
+          </w:p>
+        </w:tc>
+        <w:tc>
+          <w:tcPr>
+            <w:tcW w:type="dxa" w:w="1170"/>
+            <w:shd w:val="clear" w:color="auto" w:fill="D9E2F3"/>
+          </w:tcPr>
+          <w:p>
+            <w:r>
+              <w:rPr>
+                <w:b/>
+                <w:sz w:val="17"/>
+              </w:rPr>
+            </w:r>
+            <w:r>
+              <w:rPr>
+                <w:b/>
+                <w:sz w:val="17"/>
+              </w:rPr>
+              <w:t>Achieved power</w:t>
+            </w:r>
+          </w:p>
+        </w:tc>
+        <w:tc>
+          <w:tcPr>
+            <w:tcW w:type="dxa" w:w="1170"/>
+            <w:shd w:val="clear" w:color="auto" w:fill="D9E2F3"/>
+          </w:tcPr>
+          <w:p>
+            <w:r>
+              <w:rPr>
+                <w:b/>
+                <w:sz w:val="17"/>
+              </w:rPr>
+            </w:r>
+            <w:r>
+              <w:rPr>
+                <w:b/>
+                <w:sz w:val="17"/>
+              </w:rPr>
+              <w:t>Interpretation</w:t>
+            </w:r>
+          </w:p>
+        </w:tc>
+      </w:tr>
+      <w:tr>
+        <w:tc>
+          <w:tcPr>
+            <w:tcW w:type="dxa" w:w="1170"/>
+          </w:tcPr>
+          <w:p>
+            <w:r>
+              <w:rPr>
+                <w:sz w:val="17"/>
+              </w:rPr>
+            </w:r>
+            <w:r>
+              <w:rPr>
+                <w:sz w:val="17"/>
+              </w:rPr>
+              <w:t>BMD total → fracture</w:t>
+            </w:r>
+          </w:p>
+        </w:tc>
+        <w:tc>
+          <w:tcPr>
+            <w:tcW w:type="dxa" w:w="1170"/>
+          </w:tcPr>
+          <w:p>
+            <w:r>
+              <w:rPr>
+                <w:sz w:val="17"/>
+              </w:rPr>
+            </w:r>
+            <w:r>
+              <w:rPr>
+                <w:sz w:val="17"/>
+              </w:rPr>
+              <w:t>31</w:t>
+            </w:r>
+          </w:p>
+        </w:tc>
+        <w:tc>
+          <w:tcPr>
+            <w:tcW w:type="dxa" w:w="1170"/>
+          </w:tcPr>
+          <w:p>
+            <w:r>
+              <w:rPr>
+                <w:sz w:val="17"/>
+              </w:rPr>
+            </w:r>
+            <w:r>
+              <w:rPr>
+                <w:sz w:val="17"/>
+              </w:rPr>
+              <w:t>−0.337</w:t>
+            </w:r>
+          </w:p>
+        </w:tc>
+        <w:tc>
+          <w:tcPr>
+            <w:tcW w:type="dxa" w:w="1170"/>
+          </w:tcPr>
+          <w:p>
+            <w:r>
+              <w:rPr>
+                <w:sz w:val="17"/>
+              </w:rPr>
+            </w:r>
+            <w:r>
+              <w:rPr>
+                <w:sz w:val="17"/>
+              </w:rPr>
+              <w:t>0.022</w:t>
+            </w:r>
+          </w:p>
+        </w:tc>
+        <w:tc>
+          <w:tcPr>
+            <w:tcW w:type="dxa" w:w="1170"/>
+          </w:tcPr>
+          <w:p>
+            <w:r>
+              <w:rPr>
+                <w:sz w:val="17"/>
+              </w:rPr>
+            </w:r>
+            <w:r>
+              <w:rPr>
+                <w:sz w:val="17"/>
+              </w:rPr>
+              <w:t>15.05</w:t>
+            </w:r>
+          </w:p>
+        </w:tc>
+        <w:tc>
+          <w:tcPr>
+            <w:tcW w:type="dxa" w:w="1170"/>
+          </w:tcPr>
+          <w:p>
+            <w:r>
+              <w:rPr>
+                <w:sz w:val="17"/>
+              </w:rPr>
+            </w:r>
+            <w:r>
+              <w:rPr>
+                <w:sz w:val="17"/>
+              </w:rPr>
+              <w:t>0.063</w:t>
+            </w:r>
+          </w:p>
+        </w:tc>
+        <w:tc>
+          <w:tcPr>
+            <w:tcW w:type="dxa" w:w="1170"/>
+          </w:tcPr>
+          <w:p>
+            <w:r>
+              <w:rPr>
+                <w:sz w:val="17"/>
+              </w:rPr>
+            </w:r>
+            <w:r>
+              <w:rPr>
+                <w:sz w:val="17"/>
+              </w:rPr>
+              <w:t>1.00</w:t>
+            </w:r>
+          </w:p>
+        </w:tc>
+        <w:tc>
+          <w:tcPr>
+            <w:tcW w:type="dxa" w:w="1170"/>
+          </w:tcPr>
+          <w:p>
+            <w:r>
+              <w:rPr>
+                <w:sz w:val="17"/>
+              </w:rPr>
+            </w:r>
+            <w:r>
+              <w:rPr>
+                <w:sz w:val="17"/>
+              </w:rPr>
+              <w:t>powered</w:t>
+            </w:r>
+          </w:p>
+        </w:tc>
+      </w:tr>
+      <w:tr>
+        <w:tc>
+          <w:tcPr>
+            <w:tcW w:type="dxa" w:w="1170"/>
+          </w:tcPr>
+          <w:p>
+            <w:r>
+              <w:rPr>
+                <w:sz w:val="17"/>
+              </w:rPr>
+            </w:r>
+            <w:r>
+              <w:rPr>
+                <w:sz w:val="17"/>
+              </w:rPr>
+              <w:t>BMD femoral neck → fracture</w:t>
+            </w:r>
+          </w:p>
+        </w:tc>
+        <w:tc>
+          <w:tcPr>
+            <w:tcW w:type="dxa" w:w="1170"/>
+          </w:tcPr>
+          <w:p>
+            <w:r>
+              <w:rPr>
+                <w:sz w:val="17"/>
+              </w:rPr>
+            </w:r>
+            <w:r>
+              <w:rPr>
+                <w:sz w:val="17"/>
+              </w:rPr>
+              <w:t>25</w:t>
+            </w:r>
+          </w:p>
+        </w:tc>
+        <w:tc>
+          <w:tcPr>
+            <w:tcW w:type="dxa" w:w="1170"/>
+          </w:tcPr>
+          <w:p>
+            <w:r>
+              <w:rPr>
+                <w:sz w:val="17"/>
+              </w:rPr>
+            </w:r>
+            <w:r>
+              <w:rPr>
+                <w:sz w:val="17"/>
+              </w:rPr>
+              <w:t>−0.351</w:t>
+            </w:r>
+          </w:p>
+        </w:tc>
+        <w:tc>
+          <w:tcPr>
+            <w:tcW w:type="dxa" w:w="1170"/>
+          </w:tcPr>
+          <w:p>
+            <w:r>
+              <w:rPr>
+                <w:sz w:val="17"/>
+              </w:rPr>
+            </w:r>
+            <w:r>
+              <w:rPr>
+                <w:sz w:val="17"/>
+              </w:rPr>
+              <w:t>0.030</w:t>
+            </w:r>
+          </w:p>
+        </w:tc>
+        <w:tc>
+          <w:tcPr>
+            <w:tcW w:type="dxa" w:w="1170"/>
+          </w:tcPr>
+          <w:p>
+            <w:r>
+              <w:rPr>
+                <w:sz w:val="17"/>
+              </w:rPr>
+            </w:r>
+            <w:r>
+              <w:rPr>
+                <w:sz w:val="17"/>
+              </w:rPr>
+              <w:t>11.55</w:t>
+            </w:r>
+          </w:p>
+        </w:tc>
+        <w:tc>
+          <w:tcPr>
+            <w:tcW w:type="dxa" w:w="1170"/>
+          </w:tcPr>
+          <w:p>
+            <w:r>
+              <w:rPr>
+                <w:sz w:val="17"/>
+              </w:rPr>
+            </w:r>
+            <w:r>
+              <w:rPr>
+                <w:sz w:val="17"/>
+              </w:rPr>
+              <w:t>0.085</w:t>
+            </w:r>
+          </w:p>
+        </w:tc>
+        <w:tc>
+          <w:tcPr>
+            <w:tcW w:type="dxa" w:w="1170"/>
+          </w:tcPr>
+          <w:p>
+            <w:r>
+              <w:rPr>
+                <w:sz w:val="17"/>
+              </w:rPr>
+            </w:r>
+            <w:r>
+              <w:rPr>
+                <w:sz w:val="17"/>
+              </w:rPr>
+              <w:t>1.00</w:t>
+            </w:r>
+          </w:p>
+        </w:tc>
+        <w:tc>
+          <w:tcPr>
+            <w:tcW w:type="dxa" w:w="1170"/>
+          </w:tcPr>
+          <w:p>
+            <w:r>
+              <w:rPr>
+                <w:sz w:val="17"/>
+              </w:rPr>
+            </w:r>
+            <w:r>
+              <w:rPr>
+                <w:sz w:val="17"/>
+              </w:rPr>
+              <w:t>powered</w:t>
+            </w:r>
+          </w:p>
+        </w:tc>
+      </w:tr>
+      <w:tr>
+        <w:tc>
+          <w:tcPr>
+            <w:tcW w:type="dxa" w:w="1170"/>
+          </w:tcPr>
+          <w:p>
+            <w:r>
+              <w:rPr>
+                <w:sz w:val="17"/>
+              </w:rPr>
+            </w:r>
+            <w:r>
+              <w:rPr>
+                <w:sz w:val="17"/>
+              </w:rPr>
+              <w:t>BMD total → OA knee</w:t>
+            </w:r>
+          </w:p>
+        </w:tc>
+        <w:tc>
+          <w:tcPr>
+            <w:tcW w:type="dxa" w:w="1170"/>
+          </w:tcPr>
+          <w:p>
+            <w:r>
+              <w:rPr>
+                <w:sz w:val="17"/>
+              </w:rPr>
+            </w:r>
+            <w:r>
+              <w:rPr>
+                <w:sz w:val="17"/>
+              </w:rPr>
+              <w:t>31</w:t>
+            </w:r>
+          </w:p>
+        </w:tc>
+        <w:tc>
+          <w:tcPr>
+            <w:tcW w:type="dxa" w:w="1170"/>
+          </w:tcPr>
+          <w:p>
+            <w:r>
+              <w:rPr>
+                <w:sz w:val="17"/>
+              </w:rPr>
+            </w:r>
+            <w:r>
+              <w:rPr>
+                <w:sz w:val="17"/>
+              </w:rPr>
+              <w:t>+0.023</w:t>
+            </w:r>
+          </w:p>
+        </w:tc>
+        <w:tc>
+          <w:tcPr>
+            <w:tcW w:type="dxa" w:w="1170"/>
+          </w:tcPr>
+          <w:p>
+            <w:r>
+              <w:rPr>
+                <w:sz w:val="17"/>
+              </w:rPr>
+            </w:r>
+            <w:r>
+              <w:rPr>
+                <w:sz w:val="17"/>
+              </w:rPr>
+              <w:t>0.004</w:t>
+            </w:r>
+          </w:p>
+        </w:tc>
+        <w:tc>
+          <w:tcPr>
+            <w:tcW w:type="dxa" w:w="1170"/>
+          </w:tcPr>
+          <w:p>
+            <w:r>
+              <w:rPr>
+                <w:sz w:val="17"/>
+              </w:rPr>
+            </w:r>
+            <w:r>
+              <w:rPr>
+                <w:sz w:val="17"/>
+              </w:rPr>
+              <w:t>6.26</w:t>
+            </w:r>
+          </w:p>
+        </w:tc>
+        <w:tc>
+          <w:tcPr>
+            <w:tcW w:type="dxa" w:w="1170"/>
+          </w:tcPr>
+          <w:p>
+            <w:r>
+              <w:rPr>
+                <w:sz w:val="17"/>
+              </w:rPr>
+            </w:r>
+            <w:r>
+              <w:rPr>
+                <w:sz w:val="17"/>
+              </w:rPr>
+              <w:t>0.010</w:t>
+            </w:r>
+          </w:p>
+        </w:tc>
+        <w:tc>
+          <w:tcPr>
+            <w:tcW w:type="dxa" w:w="1170"/>
+          </w:tcPr>
+          <w:p>
+            <w:r>
+              <w:rPr>
+                <w:sz w:val="17"/>
+              </w:rPr>
+            </w:r>
+            <w:r>
+              <w:rPr>
+                <w:sz w:val="17"/>
+              </w:rPr>
+              <w:t>1.00</w:t>
+            </w:r>
+          </w:p>
+        </w:tc>
+        <w:tc>
+          <w:tcPr>
+            <w:tcW w:type="dxa" w:w="1170"/>
+          </w:tcPr>
+          <w:p>
+            <w:r>
+              <w:rPr>
+                <w:sz w:val="17"/>
+              </w:rPr>
+            </w:r>
+            <w:r>
+              <w:rPr>
+                <w:sz w:val="17"/>
+              </w:rPr>
+              <w:t>powered</w:t>
+            </w:r>
+          </w:p>
+        </w:tc>
+      </w:tr>
+      <w:tr>
+        <w:tc>
+          <w:tcPr>
+            <w:tcW w:type="dxa" w:w="1170"/>
+          </w:tcPr>
+          <w:p>
+            <w:r>
+              <w:rPr>
+                <w:sz w:val="17"/>
+              </w:rPr>
+            </w:r>
+            <w:r>
+              <w:rPr>
+                <w:sz w:val="17"/>
+              </w:rPr>
+              <w:t>Lumbar spine → OA knee</w:t>
+            </w:r>
+          </w:p>
+        </w:tc>
+        <w:tc>
+          <w:tcPr>
+            <w:tcW w:type="dxa" w:w="1170"/>
+          </w:tcPr>
+          <w:p>
+            <w:r>
+              <w:rPr>
+                <w:sz w:val="17"/>
+              </w:rPr>
+            </w:r>
+            <w:r>
+              <w:rPr>
+                <w:sz w:val="17"/>
+              </w:rPr>
+              <w:t>21</w:t>
+            </w:r>
+          </w:p>
+        </w:tc>
+        <w:tc>
+          <w:tcPr>
+            <w:tcW w:type="dxa" w:w="1170"/>
+          </w:tcPr>
+          <w:p>
+            <w:r>
+              <w:rPr>
+                <w:sz w:val="17"/>
+              </w:rPr>
+            </w:r>
+            <w:r>
+              <w:rPr>
+                <w:sz w:val="17"/>
+              </w:rPr>
+              <w:t>+0.028</w:t>
+            </w:r>
+          </w:p>
+        </w:tc>
+        <w:tc>
+          <w:tcPr>
+            <w:tcW w:type="dxa" w:w="1170"/>
+          </w:tcPr>
+          <w:p>
+            <w:r>
+              <w:rPr>
+                <w:sz w:val="17"/>
+              </w:rPr>
+            </w:r>
+            <w:r>
+              <w:rPr>
+                <w:sz w:val="17"/>
+              </w:rPr>
+              <w:t>0.005</w:t>
+            </w:r>
+          </w:p>
+        </w:tc>
+        <w:tc>
+          <w:tcPr>
+            <w:tcW w:type="dxa" w:w="1170"/>
+          </w:tcPr>
+          <w:p>
+            <w:r>
+              <w:rPr>
+                <w:sz w:val="17"/>
+              </w:rPr>
+            </w:r>
+            <w:r>
+              <w:rPr>
+                <w:sz w:val="17"/>
+              </w:rPr>
+              <w:t>5.77</w:t>
+            </w:r>
+          </w:p>
+        </w:tc>
+        <w:tc>
+          <w:tcPr>
+            <w:tcW w:type="dxa" w:w="1170"/>
+          </w:tcPr>
+          <w:p>
+            <w:r>
+              <w:rPr>
+                <w:sz w:val="17"/>
+              </w:rPr>
+            </w:r>
+            <w:r>
+              <w:rPr>
+                <w:sz w:val="17"/>
+              </w:rPr>
+              <w:t>0.014</w:t>
+            </w:r>
+          </w:p>
+        </w:tc>
+        <w:tc>
+          <w:tcPr>
+            <w:tcW w:type="dxa" w:w="1170"/>
+          </w:tcPr>
+          <w:p>
+            <w:r>
+              <w:rPr>
+                <w:sz w:val="17"/>
+              </w:rPr>
+            </w:r>
+            <w:r>
+              <w:rPr>
+                <w:sz w:val="17"/>
+              </w:rPr>
+              <w:t>1.00</w:t>
+            </w:r>
+          </w:p>
+        </w:tc>
+        <w:tc>
+          <w:tcPr>
+            <w:tcW w:type="dxa" w:w="1170"/>
+          </w:tcPr>
+          <w:p>
+            <w:r>
+              <w:rPr>
+                <w:sz w:val="17"/>
+              </w:rPr>
+            </w:r>
+            <w:r>
+              <w:rPr>
+                <w:sz w:val="17"/>
+              </w:rPr>
+              <w:t>powered</w:t>
+            </w:r>
+          </w:p>
+        </w:tc>
+      </w:tr>
+      <w:tr>
+        <w:tc>
+          <w:tcPr>
+            <w:tcW w:type="dxa" w:w="1170"/>
+          </w:tcPr>
+          <w:p>
+            <w:r>
+              <w:rPr>
+                <w:sz w:val="17"/>
+              </w:rPr>
+            </w:r>
+            <w:r>
+              <w:rPr>
+                <w:sz w:val="17"/>
+              </w:rPr>
+              <w:t>Arms → OA knee</w:t>
+            </w:r>
+          </w:p>
+        </w:tc>
+        <w:tc>
+          <w:tcPr>
+            <w:tcW w:type="dxa" w:w="1170"/>
+          </w:tcPr>
+          <w:p>
+            <w:r>
+              <w:rPr>
+                <w:sz w:val="17"/>
+              </w:rPr>
+            </w:r>
+            <w:r>
+              <w:rPr>
+                <w:sz w:val="17"/>
+              </w:rPr>
+              <w:t>16</w:t>
+            </w:r>
+          </w:p>
+        </w:tc>
+        <w:tc>
+          <w:tcPr>
+            <w:tcW w:type="dxa" w:w="1170"/>
+          </w:tcPr>
+          <w:p>
+            <w:r>
+              <w:rPr>
+                <w:sz w:val="17"/>
+              </w:rPr>
+            </w:r>
+            <w:r>
+              <w:rPr>
+                <w:sz w:val="17"/>
+              </w:rPr>
+              <w:t>+0.022</w:t>
+            </w:r>
+          </w:p>
+        </w:tc>
+        <w:tc>
+          <w:tcPr>
+            <w:tcW w:type="dxa" w:w="1170"/>
+          </w:tcPr>
+          <w:p>
+            <w:r>
+              <w:rPr>
+                <w:sz w:val="17"/>
+              </w:rPr>
+            </w:r>
+            <w:r>
+              <w:rPr>
+                <w:sz w:val="17"/>
+              </w:rPr>
+              <w:t>0.005</w:t>
+            </w:r>
+          </w:p>
+        </w:tc>
+        <w:tc>
+          <w:tcPr>
+            <w:tcW w:type="dxa" w:w="1170"/>
+          </w:tcPr>
+          <w:p>
+            <w:r>
+              <w:rPr>
+                <w:sz w:val="17"/>
+              </w:rPr>
+            </w:r>
+            <w:r>
+              <w:rPr>
+                <w:sz w:val="17"/>
+              </w:rPr>
+              <w:t>4.78</w:t>
+            </w:r>
+          </w:p>
+        </w:tc>
+        <w:tc>
+          <w:tcPr>
+            <w:tcW w:type="dxa" w:w="1170"/>
+          </w:tcPr>
+          <w:p>
+            <w:r>
+              <w:rPr>
+                <w:sz w:val="17"/>
+              </w:rPr>
+            </w:r>
+            <w:r>
+              <w:rPr>
+                <w:sz w:val="17"/>
+              </w:rPr>
+              <w:t>0.013</w:t>
+            </w:r>
+          </w:p>
+        </w:tc>
+        <w:tc>
+          <w:tcPr>
+            <w:tcW w:type="dxa" w:w="1170"/>
+          </w:tcPr>
+          <w:p>
+            <w:r>
+              <w:rPr>
+                <w:sz w:val="17"/>
+              </w:rPr>
+            </w:r>
+            <w:r>
+              <w:rPr>
+                <w:sz w:val="17"/>
+              </w:rPr>
+              <w:t>1.00</w:t>
+            </w:r>
+          </w:p>
+        </w:tc>
+        <w:tc>
+          <w:tcPr>
+            <w:tcW w:type="dxa" w:w="1170"/>
+          </w:tcPr>
+          <w:p>
+            <w:r>
+              <w:rPr>
+                <w:sz w:val="17"/>
+              </w:rPr>
+            </w:r>
+            <w:r>
+              <w:rPr>
+                <w:sz w:val="17"/>
+              </w:rPr>
+              <w:t>powered</w:t>
+            </w:r>
+          </w:p>
+        </w:tc>
+      </w:tr>
+      <w:tr>
+        <w:tc>
+          <w:tcPr>
+            <w:tcW w:type="dxa" w:w="1170"/>
+          </w:tcPr>
+          <w:p>
+            <w:r>
+              <w:rPr>
+                <w:sz w:val="17"/>
+              </w:rPr>
+            </w:r>
+            <w:r>
+              <w:rPr>
+                <w:sz w:val="17"/>
+              </w:rPr>
+              <w:t>Legs → OA knee</w:t>
+            </w:r>
+          </w:p>
+        </w:tc>
+        <w:tc>
+          <w:tcPr>
+            <w:tcW w:type="dxa" w:w="1170"/>
+          </w:tcPr>
+          <w:p>
+            <w:r>
+              <w:rPr>
+                <w:sz w:val="17"/>
+              </w:rPr>
+            </w:r>
+            <w:r>
+              <w:rPr>
+                <w:sz w:val="17"/>
+              </w:rPr>
+              <w:t>24</w:t>
+            </w:r>
+          </w:p>
+        </w:tc>
+        <w:tc>
+          <w:tcPr>
+            <w:tcW w:type="dxa" w:w="1170"/>
+          </w:tcPr>
+          <w:p>
+            <w:r>
+              <w:rPr>
+                <w:sz w:val="17"/>
+              </w:rPr>
+            </w:r>
+            <w:r>
+              <w:rPr>
+                <w:sz w:val="17"/>
+              </w:rPr>
+              <w:t>+0.018</w:t>
+            </w:r>
+          </w:p>
+        </w:tc>
+        <w:tc>
+          <w:tcPr>
+            <w:tcW w:type="dxa" w:w="1170"/>
+          </w:tcPr>
+          <w:p>
+            <w:r>
+              <w:rPr>
+                <w:sz w:val="17"/>
+              </w:rPr>
+            </w:r>
+            <w:r>
+              <w:rPr>
+                <w:sz w:val="17"/>
+              </w:rPr>
+              <w:t>0.004</w:t>
+            </w:r>
+          </w:p>
+        </w:tc>
+        <w:tc>
+          <w:tcPr>
+            <w:tcW w:type="dxa" w:w="1170"/>
+          </w:tcPr>
+          <w:p>
+            <w:r>
+              <w:rPr>
+                <w:sz w:val="17"/>
+              </w:rPr>
+            </w:r>
+            <w:r>
+              <w:rPr>
+                <w:sz w:val="17"/>
+              </w:rPr>
+              <w:t>4.23</w:t>
+            </w:r>
+          </w:p>
+        </w:tc>
+        <w:tc>
+          <w:tcPr>
+            <w:tcW w:type="dxa" w:w="1170"/>
+          </w:tcPr>
+          <w:p>
+            <w:r>
+              <w:rPr>
+                <w:sz w:val="17"/>
+              </w:rPr>
+            </w:r>
+            <w:r>
+              <w:rPr>
+                <w:sz w:val="17"/>
+              </w:rPr>
+              <w:t>0.012</w:t>
+            </w:r>
+          </w:p>
+        </w:tc>
+        <w:tc>
+          <w:tcPr>
+            <w:tcW w:type="dxa" w:w="1170"/>
+          </w:tcPr>
+          <w:p>
+            <w:r>
+              <w:rPr>
+                <w:sz w:val="17"/>
+              </w:rPr>
+            </w:r>
+            <w:r>
+              <w:rPr>
+                <w:sz w:val="17"/>
+              </w:rPr>
+              <w:t>0.99</w:t>
+            </w:r>
+          </w:p>
+        </w:tc>
+        <w:tc>
+          <w:tcPr>
+            <w:tcW w:type="dxa" w:w="1170"/>
+          </w:tcPr>
+          <w:p>
+            <w:r>
+              <w:rPr>
+                <w:sz w:val="17"/>
+              </w:rPr>
+            </w:r>
+            <w:r>
+              <w:rPr>
+                <w:sz w:val="17"/>
+              </w:rPr>
+              <w:t>powered</w:t>
+            </w:r>
+          </w:p>
+        </w:tc>
+      </w:tr>
+      <w:tr>
+        <w:tc>
+          <w:tcPr>
+            <w:tcW w:type="dxa" w:w="1170"/>
+          </w:tcPr>
+          <w:p>
+            <w:r>
+              <w:rPr>
+                <w:sz w:val="17"/>
+              </w:rPr>
+            </w:r>
+            <w:r>
+              <w:rPr>
+                <w:sz w:val="17"/>
+              </w:rPr>
+              <w:t>Femoral neck → OA knee</w:t>
+            </w:r>
+          </w:p>
+        </w:tc>
+        <w:tc>
+          <w:tcPr>
+            <w:tcW w:type="dxa" w:w="1170"/>
+          </w:tcPr>
+          <w:p>
+            <w:r>
+              <w:rPr>
+                <w:sz w:val="17"/>
+              </w:rPr>
+            </w:r>
+            <w:r>
+              <w:rPr>
+                <w:sz w:val="17"/>
+              </w:rPr>
+              <w:t>25</w:t>
+            </w:r>
+          </w:p>
+        </w:tc>
+        <w:tc>
+          <w:tcPr>
+            <w:tcW w:type="dxa" w:w="1170"/>
+          </w:tcPr>
+          <w:p>
+            <w:r>
+              <w:rPr>
+                <w:sz w:val="17"/>
+              </w:rPr>
+            </w:r>
+            <w:r>
+              <w:rPr>
+                <w:sz w:val="17"/>
+              </w:rPr>
+              <w:t>+0.017</w:t>
+            </w:r>
+          </w:p>
+        </w:tc>
+        <w:tc>
+          <w:tcPr>
+            <w:tcW w:type="dxa" w:w="1170"/>
+          </w:tcPr>
+          <w:p>
+            <w:r>
+              <w:rPr>
+                <w:sz w:val="17"/>
+              </w:rPr>
+            </w:r>
+            <w:r>
+              <w:rPr>
+                <w:sz w:val="17"/>
+              </w:rPr>
+              <w:t>0.005</w:t>
+            </w:r>
+          </w:p>
+        </w:tc>
+        <w:tc>
+          <w:tcPr>
+            <w:tcW w:type="dxa" w:w="1170"/>
+          </w:tcPr>
+          <w:p>
+            <w:r>
+              <w:rPr>
+                <w:sz w:val="17"/>
+              </w:rPr>
+            </w:r>
+            <w:r>
+              <w:rPr>
+                <w:sz w:val="17"/>
+              </w:rPr>
+              <w:t>3.42</w:t>
+            </w:r>
+          </w:p>
+        </w:tc>
+        <w:tc>
+          <w:tcPr>
+            <w:tcW w:type="dxa" w:w="1170"/>
+          </w:tcPr>
+          <w:p>
+            <w:r>
+              <w:rPr>
+                <w:sz w:val="17"/>
+              </w:rPr>
+            </w:r>
+            <w:r>
+              <w:rPr>
+                <w:sz w:val="17"/>
+              </w:rPr>
+              <w:t>0.014</w:t>
+            </w:r>
+          </w:p>
+        </w:tc>
+        <w:tc>
+          <w:tcPr>
+            <w:tcW w:type="dxa" w:w="1170"/>
+          </w:tcPr>
+          <w:p>
+            <w:r>
+              <w:rPr>
+                <w:sz w:val="17"/>
+              </w:rPr>
+            </w:r>
+            <w:r>
+              <w:rPr>
+                <w:sz w:val="17"/>
+              </w:rPr>
+              <w:t>0.93</w:t>
+            </w:r>
+          </w:p>
+        </w:tc>
+        <w:tc>
+          <w:tcPr>
+            <w:tcW w:type="dxa" w:w="1170"/>
+          </w:tcPr>
+          <w:p>
+            <w:r>
+              <w:rPr>
+                <w:sz w:val="17"/>
+              </w:rPr>
+            </w:r>
+            <w:r>
+              <w:rPr>
+                <w:sz w:val="17"/>
+              </w:rPr>
+              <w:t>powered</w:t>
+            </w:r>
+          </w:p>
+        </w:tc>
+      </w:tr>
+      <w:tr>
+        <w:tc>
+          <w:tcPr>
+            <w:tcW w:type="dxa" w:w="1170"/>
+          </w:tcPr>
+          <w:p>
+            <w:r>
+              <w:rPr>
+                <w:sz w:val="17"/>
+              </w:rPr>
+            </w:r>
+            <w:r>
+              <w:rPr>
+                <w:sz w:val="17"/>
+              </w:rPr>
+              <w:t>OA knee → fracture</w:t>
+            </w:r>
+          </w:p>
+        </w:tc>
+        <w:tc>
+          <w:tcPr>
+            <w:tcW w:type="dxa" w:w="1170"/>
+          </w:tcPr>
+          <w:p>
+            <w:r>
+              <w:rPr>
+                <w:sz w:val="17"/>
+              </w:rPr>
+            </w:r>
+            <w:r>
+              <w:rPr>
+                <w:sz w:val="17"/>
+              </w:rPr>
+              <w:t>69</w:t>
+            </w:r>
+          </w:p>
+        </w:tc>
+        <w:tc>
+          <w:tcPr>
+            <w:tcW w:type="dxa" w:w="1170"/>
+          </w:tcPr>
+          <w:p>
+            <w:r>
+              <w:rPr>
+                <w:sz w:val="17"/>
+              </w:rPr>
+            </w:r>
+            <w:r>
+              <w:rPr>
+                <w:sz w:val="17"/>
+              </w:rPr>
+              <w:t>+0.092</w:t>
+            </w:r>
+          </w:p>
+        </w:tc>
+        <w:tc>
+          <w:tcPr>
+            <w:tcW w:type="dxa" w:w="1170"/>
+          </w:tcPr>
+          <w:p>
+            <w:r>
+              <w:rPr>
+                <w:sz w:val="17"/>
+              </w:rPr>
+            </w:r>
+            <w:r>
+              <w:rPr>
+                <w:sz w:val="17"/>
+              </w:rPr>
+              <w:t>0.108</w:t>
+            </w:r>
+          </w:p>
+        </w:tc>
+        <w:tc>
+          <w:tcPr>
+            <w:tcW w:type="dxa" w:w="1170"/>
+          </w:tcPr>
+          <w:p>
+            <w:r>
+              <w:rPr>
+                <w:sz w:val="17"/>
+              </w:rPr>
+            </w:r>
+            <w:r>
+              <w:rPr>
+                <w:sz w:val="17"/>
+              </w:rPr>
+              <w:t>0.85</w:t>
+            </w:r>
+          </w:p>
+        </w:tc>
+        <w:tc>
+          <w:tcPr>
+            <w:tcW w:type="dxa" w:w="1170"/>
+          </w:tcPr>
+          <w:p>
+            <w:r>
+              <w:rPr>
+                <w:sz w:val="17"/>
+              </w:rPr>
+            </w:r>
+            <w:r>
+              <w:rPr>
+                <w:sz w:val="17"/>
+              </w:rPr>
+              <w:t>0.304</w:t>
+            </w:r>
+          </w:p>
+        </w:tc>
+        <w:tc>
+          <w:tcPr>
+            <w:tcW w:type="dxa" w:w="1170"/>
+          </w:tcPr>
+          <w:p>
+            <w:r>
+              <w:rPr>
+                <w:sz w:val="17"/>
+              </w:rPr>
+            </w:r>
+            <w:r>
+              <w:rPr>
+                <w:sz w:val="17"/>
+              </w:rPr>
+              <w:t>0.14</w:t>
+            </w:r>
+          </w:p>
+        </w:tc>
+        <w:tc>
+          <w:tcPr>
+            <w:tcW w:type="dxa" w:w="1170"/>
+          </w:tcPr>
+          <w:p>
+            <w:r>
+              <w:rPr>
+                <w:sz w:val="17"/>
+              </w:rPr>
+            </w:r>
+            <w:r>
+              <w:rPr>
+                <w:sz w:val="17"/>
+              </w:rPr>
+              <w:t>underpowered</w:t>
+            </w:r>
+          </w:p>
+        </w:tc>
+      </w:tr>
+      <w:tr>
+        <w:tc>
+          <w:tcPr>
+            <w:tcW w:type="dxa" w:w="1170"/>
+          </w:tcPr>
+          <w:p>
+            <w:r>
+              <w:rPr>
+                <w:sz w:val="17"/>
+              </w:rPr>
+            </w:r>
+            <w:r>
+              <w:rPr>
+                <w:sz w:val="17"/>
+              </w:rPr>
+              <w:t>OA knee → BMD total</w:t>
+            </w:r>
+          </w:p>
+        </w:tc>
+        <w:tc>
+          <w:tcPr>
+            <w:tcW w:type="dxa" w:w="1170"/>
+          </w:tcPr>
+          <w:p>
+            <w:r>
+              <w:rPr>
+                <w:sz w:val="17"/>
+              </w:rPr>
+            </w:r>
+            <w:r>
+              <w:rPr>
+                <w:sz w:val="17"/>
+              </w:rPr>
+              <w:t>69</w:t>
+            </w:r>
+          </w:p>
+        </w:tc>
+        <w:tc>
+          <w:tcPr>
+            <w:tcW w:type="dxa" w:w="1170"/>
+          </w:tcPr>
+          <w:p>
+            <w:r>
+              <w:rPr>
+                <w:sz w:val="17"/>
+              </w:rPr>
+            </w:r>
+            <w:r>
+              <w:rPr>
+                <w:sz w:val="17"/>
+              </w:rPr>
+              <w:t>+0.106</w:t>
+            </w:r>
+          </w:p>
+        </w:tc>
+        <w:tc>
+          <w:tcPr>
+            <w:tcW w:type="dxa" w:w="1170"/>
+          </w:tcPr>
+          <w:p>
+            <w:r>
+              <w:rPr>
+                <w:sz w:val="17"/>
+              </w:rPr>
+            </w:r>
+            <w:r>
+              <w:rPr>
+                <w:sz w:val="17"/>
+              </w:rPr>
+              <w:t>0.108</w:t>
+            </w:r>
+          </w:p>
+        </w:tc>
+        <w:tc>
+          <w:tcPr>
+            <w:tcW w:type="dxa" w:w="1170"/>
+          </w:tcPr>
+          <w:p>
+            <w:r>
+              <w:rPr>
+                <w:sz w:val="17"/>
+              </w:rPr>
+            </w:r>
+            <w:r>
+              <w:rPr>
+                <w:sz w:val="17"/>
+              </w:rPr>
+              <w:t>0.98</w:t>
+            </w:r>
+          </w:p>
+        </w:tc>
+        <w:tc>
+          <w:tcPr>
+            <w:tcW w:type="dxa" w:w="1170"/>
+          </w:tcPr>
+          <w:p>
+            <w:r>
+              <w:rPr>
+                <w:sz w:val="17"/>
+              </w:rPr>
+            </w:r>
+            <w:r>
+              <w:rPr>
+                <w:sz w:val="17"/>
+              </w:rPr>
+              <w:t>0.303</w:t>
+            </w:r>
+          </w:p>
+        </w:tc>
+        <w:tc>
+          <w:tcPr>
+            <w:tcW w:type="dxa" w:w="1170"/>
+          </w:tcPr>
+          <w:p>
+            <w:r>
+              <w:rPr>
+                <w:sz w:val="17"/>
+              </w:rPr>
+            </w:r>
+            <w:r>
+              <w:rPr>
+                <w:sz w:val="17"/>
+              </w:rPr>
+              <w:t>0.17</w:t>
+            </w:r>
+          </w:p>
+        </w:tc>
+        <w:tc>
+          <w:tcPr>
+            <w:tcW w:type="dxa" w:w="1170"/>
+          </w:tcPr>
+          <w:p>
+            <w:r>
+              <w:rPr>
+                <w:sz w:val="17"/>
+              </w:rPr>
+            </w:r>
+            <w:r>
+              <w:rPr>
+                <w:sz w:val="17"/>
+              </w:rPr>
+              <w:t>underpowered</w:t>
+            </w:r>
+          </w:p>
+        </w:tc>
+      </w:tr>
+      <w:tr>
+        <w:tc>
+          <w:tcPr>
+            <w:tcW w:type="dxa" w:w="1170"/>
+          </w:tcPr>
+          <w:p>
+            <w:r>
+              <w:rPr>
+                <w:sz w:val="17"/>
+              </w:rPr>
+            </w:r>
+            <w:r>
+              <w:rPr>
+                <w:sz w:val="17"/>
+              </w:rPr>
+              <w:t>OA knee → BMD femoral neck</w:t>
+            </w:r>
+          </w:p>
+        </w:tc>
+        <w:tc>
+          <w:tcPr>
+            <w:tcW w:type="dxa" w:w="1170"/>
+          </w:tcPr>
+          <w:p>
+            <w:r>
+              <w:rPr>
+                <w:sz w:val="17"/>
+              </w:rPr>
+            </w:r>
+            <w:r>
+              <w:rPr>
+                <w:sz w:val="17"/>
+              </w:rPr>
+              <w:t>69</w:t>
+            </w:r>
+          </w:p>
+        </w:tc>
+        <w:tc>
+          <w:tcPr>
+            <w:tcW w:type="dxa" w:w="1170"/>
+          </w:tcPr>
+          <w:p>
+            <w:r>
+              <w:rPr>
+                <w:sz w:val="17"/>
+              </w:rPr>
+            </w:r>
+            <w:r>
+              <w:rPr>
+                <w:sz w:val="17"/>
+              </w:rPr>
+              <w:t>+0.142</w:t>
+            </w:r>
+          </w:p>
+        </w:tc>
+        <w:tc>
+          <w:tcPr>
+            <w:tcW w:type="dxa" w:w="1170"/>
+          </w:tcPr>
+          <w:p>
+            <w:r>
+              <w:rPr>
+                <w:sz w:val="17"/>
+              </w:rPr>
+            </w:r>
+            <w:r>
+              <w:rPr>
+                <w:sz w:val="17"/>
+              </w:rPr>
+              <w:t>0.108</w:t>
+            </w:r>
+          </w:p>
+        </w:tc>
+        <w:tc>
+          <w:tcPr>
+            <w:tcW w:type="dxa" w:w="1170"/>
+          </w:tcPr>
+          <w:p>
+            <w:r>
+              <w:rPr>
+                <w:sz w:val="17"/>
+              </w:rPr>
+            </w:r>
+            <w:r>
+              <w:rPr>
+                <w:sz w:val="17"/>
+              </w:rPr>
+              <w:t>1.31</w:t>
+            </w:r>
+          </w:p>
+        </w:tc>
+        <w:tc>
+          <w:tcPr>
+            <w:tcW w:type="dxa" w:w="1170"/>
+          </w:tcPr>
+          <w:p>
+            <w:r>
+              <w:rPr>
+                <w:sz w:val="17"/>
+              </w:rPr>
+            </w:r>
+            <w:r>
+              <w:rPr>
+                <w:sz w:val="17"/>
+              </w:rPr>
+              <w:t>0.303</w:t>
+            </w:r>
+          </w:p>
+        </w:tc>
+        <w:tc>
+          <w:tcPr>
+            <w:tcW w:type="dxa" w:w="1170"/>
+          </w:tcPr>
+          <w:p>
+            <w:r>
+              <w:rPr>
+                <w:sz w:val="17"/>
+              </w:rPr>
+            </w:r>
+            <w:r>
+              <w:rPr>
+                <w:sz w:val="17"/>
+              </w:rPr>
+              <w:t>0.26</w:t>
+            </w:r>
+          </w:p>
+        </w:tc>
+        <w:tc>
+          <w:tcPr>
+            <w:tcW w:type="dxa" w:w="1170"/>
+          </w:tcPr>
+          <w:p>
+            <w:r>
+              <w:rPr>
+                <w:sz w:val="17"/>
+              </w:rPr>
+            </w:r>
+            <w:r>
+              <w:rPr>
+                <w:sz w:val="17"/>
+              </w:rPr>
+              <w:t>underpowered</w:t>
+            </w:r>
+          </w:p>
+        </w:tc>
+      </w:tr>
+    </w:tbl>
+    <w:p/>
+    <w:p>
+      <w:r>
+        <w:t>MDE = (1.96 + 0.84) × SE is the minimum \|β\| detectable at 80% power with a two-sided α = 0.05; achieved power is computed for the observed point estimate. \|β\|/SE is invariant to the N-scale correction (§3.7), so all power statements are unaffected by it. For the fracture outcome the MDE corresponds to OR ≈ 1.07 per 1-SD lower total-body BMD, OR ≈ 1.09 per 1-SD lower femoral-neck BMD, and OR ≈ 1.36 per unit of the knee-OA exposure contrast as scaled in Table 3 (see the scale caveats in §3.5 and §3.7). K = strict instrument count.</w:t>
       </w:r>
     </w:p>
     <w:p>

</xml_diff>

<commit_message>
OA_B_PROJECT v9: add Figures 8-9 + SupplFig S3 from real results; fix OA_knee axis units; keep v8 figure snapshot
</commit_message>
<xml_diff>
--- a/submission_package_v2/Manuscript.docx
+++ b/submission_package_v2/Manuscript.docx
@@ -658,7 +658,7 @@
         <w:t>overlap_statistics.csv</w:t>
       </w:r>
       <w:r>
-        <w:t>, Supplementary); ρ_GE has the same sign as the MR effect for every pair (positive for BMD→OA, negative for BMD→fracture; range −0.79 to +0.46 across the ten pairs), confirming that the IVW direction is not driven by a single anti-correlated instrument. Third, an overlap-robust correction (MRlap; Mounier &amp; Kutalik 2023 [15]) and a sensitivity analysis restricted to the non-UKB components of the GO and GEFOS consortia are planned before final inference; the wholly-UKB BMD and OA_selfrep GWAS cannot be separated from their UKB overlap, so the BMD-exposure pairs retain some residual overlap that the robust estimators above are intended to absorb.</w:t>
+        <w:t>, Supplementary; Figure 9); ρ_GE has the same sign as the MR effect for every pair (positive for BMD→OA, negative for BMD→fracture; range −0.79 to +0.46 across the ten pairs), confirming that the IVW direction is not driven by a single anti-correlated instrument. Third, an overlap-robust correction (MRlap; Mounier &amp; Kutalik 2023 [15]) and a sensitivity analysis restricted to the non-UKB components of the GO and GEFOS consortia are planned before final inference; the wholly-UKB BMD and OA_selfrep GWAS cannot be separated from their UKB overlap, so the BMD-exposure pairs retain some residual overlap that the robust estimators above are intended to absorb.</w:t>
       </w:r>
     </w:p>
     <w:p>
@@ -1643,7 +1643,7 @@
     </w:p>
     <w:p>
       <w:r>
-        <w:t>After correction, genetically predicted BMD gives OR = 1.40 (95% CI 1.34–1.46) for fracture per 1-SD lower total-body BMD and OR = 1.42 (95% CI 1.34–1.51) for femoral-neck BMD (strict-clumped primary; the 1-Mb sensitivity gave 1.40 and 1.44). The GEFOS consortium reported OR = 1.55 (95% CI 1.48–1.63) per 1-SD lower femoral-neck BMD in 37,857 cases and 227,116 controls (Trajanoska et al. 2018). Our estimates are 8–10% lower, with overlapping confidence intervals, which is close agreement given the different cohorts, fracture definitions and BMD measurement sites (total-body OR 1.40 is 9.6% below 1.55; femoral-neck OR 1.42 is 8.4% below). An independent consortium therefore validates the pipeline: the direction matches and the magnitude falls within about 10%, which supports the biological plausibility of the reconstructed BMD effect scale. The BMD sample size is taken from the source publication's per-site metadata (Qian et al. 2025), not inferred from the GEFOS comparison. Per-site N varies across the accession series (30,449–32,017; §2.1). Using site-specific correction factors instead of the unified √(400,000/31,873) = 3.5426 changes the absolute β by less than 0.3% for the headline estimates (total-body and femoral-neck BMD) and by at most 2.3% for the smallest site (lumbar spine, N=30,449), an order of magnitude below the 8–10% GEFOS agreement band. No rounded value in Table 3 changes (OR 1.40 / 1.42; all β to three decimals), and z-statistics, p-values, directions and significance are unaffected, being N-scale-invariant.</w:t>
+        <w:t>After correction, genetically predicted BMD gives OR = 1.40 (95% CI 1.34–1.46) for fracture per 1-SD lower total-body BMD and OR = 1.42 (95% CI 1.34–1.51) for femoral-neck BMD (strict-clumped primary; the 1-Mb sensitivity gave 1.40 and 1.44). The GEFOS consortium reported OR = 1.55 (95% CI 1.48–1.63) per 1-SD lower femoral-neck BMD in 37,857 cases and 227,116 controls (Trajanoska et al. 2018); the two are compared directly in Supplementary Figure S3. Our estimates are 8–10% lower, with overlapping confidence intervals, which is close agreement given the different cohorts, fracture definitions and BMD measurement sites (total-body OR 1.40 is 9.6% below 1.55; femoral-neck OR 1.42 is 8.4% below). An independent consortium therefore validates the pipeline: the direction matches and the magnitude falls within about 10%, which supports the biological plausibility of the reconstructed BMD effect scale. The BMD sample size is taken from the source publication's per-site metadata (Qian et al. 2025), not inferred from the GEFOS comparison. Per-site N varies across the accession series (30,449–32,017; §2.1). Using site-specific correction factors instead of the unified √(400,000/31,873) = 3.5426 changes the absolute β by less than 0.3% for the headline estimates (total-body and femoral-neck BMD) and by at most 2.3% for the smallest site (lumbar spine, N=30,449), an order of magnitude below the 8–10% GEFOS agreement band. No rounded value in Table 3 changes (OR 1.40 / 1.42; all β to three decimals), and z-statistics, p-values, directions and significance are unaffected, being N-scale-invariant.</w:t>
       </w:r>
     </w:p>
     <w:p>
@@ -1656,7 +1656,7 @@
     </w:p>
     <w:p>
       <w:r>
-        <w:t xml:space="preserve">A non-significant IVW estimate is informative only if the analysis could have detected an effect of a plausible size. We therefore computed, for every pair, the minimum detectable effect at 80% power with a two-sided α = 0.05, MDE = (1.96 + 0.84) × SE, together with the achieved power for the observed point estimate (Table 4; </w:t>
+        <w:t xml:space="preserve">A non-significant IVW estimate is informative only if the analysis could have detected an effect of a plausible size. We therefore computed, for every pair, the minimum detectable effect at 80% power with a two-sided α = 0.05, MDE = (1.96 + 0.84) × SE, together with the achieved power for the observed point estimate (Table 4; Figure 8; </w:t>
       </w:r>
       <w:r>
         <w:rPr>
@@ -1861,7 +1861,7 @@
         <w:t>Figure 6.</w:t>
       </w:r>
       <w:r>
-        <w:t xml:space="preserve"> Per-SNP scatter plots of the MR exposure–outcome associations for four headline pairs. Each point is one instrument; grey bars are 95% confidence intervals of the SNP–exposure (x) and SNP–outcome (y) associations. Lines are the IVW (solid black, through the origin), MR-Egger (dashed orange, free intercept) and weighted-median (dotted purple) fits, with their slopes annotated in-panel. (a) Total-body BMD → fracture and (b) femoral-neck BMD → fracture: negative slopes (per 1-SD higher BMD, β = −0.337 and −0.351 log-OR), the positive control. (c) Total-body BMD → knee OA: positive slope (β = +0.023, P = 3.9×10⁻¹⁰). (d) Knee OA → total-body BMD: flat slope (β = +0.106, P = 0.33), the representative null. Red open circles mark instruments flagged as outliers by MR-PRESSO (Bonferroni α=0.05/K); their removal does not change any slope direction.</w:t>
+        <w:t xml:space="preserve"> Per-SNP scatter plots of the MR exposure–outcome associations for four headline pairs. Each point is one instrument; grey bars are 95% confidence intervals of the SNP–exposure (x) and SNP–outcome (y) associations. Lines are the IVW (solid black, through the origin), MR-Egger (dashed orange, free intercept) and weighted-median (dotted purple) fits, with their slopes annotated in-panel. (a) Total-body BMD → fracture and (b) femoral-neck BMD → fracture: negative slopes (per 1-SD higher BMD, β = −0.337 and −0.351 log-OR), the positive control. (c) Total-body BMD → knee OA: positive slope (β = +0.023, P = 3.9×10⁻¹⁰). (d) Knee OA → total-body BMD: flat slope (β = +0.106, P = 0.33), the representative null. Axis units follow the source GWAS scale of each trait: SNP effects on fracture are log-odds ratios per allele, effects on BMD are in SD units per allele, and effects on knee OA are on the standardised (linear-model) scale of the source GWAS, so knee-OA slopes are not odds ratios and are not exponentiated (§3.5). Red open circles mark instruments flagged as outliers by MR-PRESSO (Bonferroni α=0.05/K); their removal does not change any slope direction.</w:t>
       </w:r>
     </w:p>
     <w:p>
@@ -1895,6 +1895,49 @@
       </w:r>
       <w:r>
         <w:t xml:space="preserve"> Leave-one-out stability of the IVW estimate for all ten MR pairs. Black points show the IVW estimate using all instruments (whiskers, 95% CI); the shaded blue band spans the minimum-to-maximum range of the estimates obtained by dropping each instrument in turn, with individual leave-one-out estimates as light blue dots. No leave-one-out estimate crosses the null line (dashed) for any pair, excluding single-instrument drivers of any conclusion.</w:t>
+      </w:r>
+    </w:p>
+    <w:p>
+      <w:r>
+        <w:rPr>
+          <w:b/>
+        </w:rPr>
+        <w:t>Figure 8.</w:t>
+      </w:r>
+      <w:r>
+        <w:t xml:space="preserve"> Statistical power of the two-sample MR design (§3.8, Table 4). (a) Achieved power as a function of the standardised effect size \|β\|/SE at two-sided α = 0.05 (solid line), with the ten observed MR pairs overlaid. Filled blue circles are the seven pairs underlying the positive-control and BMD→OA findings; red open circles are the three null pairs. The dashed grey line marks 80% power and the dotted orange line the corresponding detection threshold \|z\| = 2.80 (MDE = 2.80 × SE). (b) Achieved power for each pair at its observed point estimate (K = strict instrument count). Blue bars meet or exceed the 80% threshold (dotted orange line); red bars fall below it. The three null pairs (knee OA → fracture, knee OA → total BMD, knee OA → femoral-neck BMD) reach only 0.14–0.26 power and can exclude only \|β\| ≥ 0.303, so their non-significant results are an absence of evidence rather than evidence of absence.</w:t>
+      </w:r>
+    </w:p>
+    <w:p>
+      <w:r>
+        <w:rPr>
+          <w:b/>
+        </w:rPr>
+        <w:t>Figure 9.</w:t>
+      </w:r>
+      <w:r>
+        <w:t xml:space="preserve"> Sample-overlap diagnostics for the ten MR pairs (§2.8). (a) ρ_GE, the correlation between SNP–exposure and SNP–outcome z-statistics across the harmonised instruments (</w:t>
+      </w:r>
+      <w:r>
+        <w:rPr>
+          <w:rFonts w:ascii="Consolas" w:hAnsi="Consolas"/>
+          <w:sz w:val="18"/>
+        </w:rPr>
+        <w:t>overlap_statistics.csv</w:t>
+      </w:r>
+      <w:r>
+        <w:t>, Supplementary). Positive bars (blue) are the BMD→OA pairs; negative bars (red) are the BMD→fracture pairs. ρ_GE shares the sign of the MR effect in all ten pairs, so no pair owes its direction to a single anti-correlated instrument. (b) ρ_GE against the signed IVW z-statistic; shaded regions are the sign-concordant quadrants, and all ten pairs fall within them (10/10 concordant). Because the exposure and outcome GWAS share UK Biobank participants, ρ_GE also reflects the sample-overlap component of the summary-statistic correlation; such overlap inflates IVW magnitudes toward r_g without changing signs, p-values or directions [14].</w:t>
+      </w:r>
+    </w:p>
+    <w:p>
+      <w:r>
+        <w:rPr>
+          <w:b/>
+        </w:rPr>
+        <w:t>Supplementary Figure S3.</w:t>
+      </w:r>
+      <w:r>
+        <w:t xml:space="preserve"> External validation of the reconstructed BMD effect scale against the independent GEFOS benchmark (§3.7). Odds ratios for any fracture per 1-SD lower BMD are shown for GEFOS 2018 (femoral-neck BMD; Trajanoska et al.), for this study's femoral-neck BMD instrument set under the primary strict clumping and the conservative 1-Mb sensitivity clumping, and for this study's total-body BMD instrument set. Whiskers are 95% confidence intervals; the dashed line is the null (OR = 1). This study's estimates lie 8–10% below GEFOS with overlapping confidence intervals, supporting the biological plausibility of the reconstructed effect scale.</w:t>
       </w:r>
     </w:p>
     <w:p>

</xml_diff>